<commit_message>
Stage B: mu-link manual covers the Latency setting and the Dropouts lamp
New "Latency and the Dropouts Lamp" subsection, a troubleshooting bullet and
a spec line; regenerated the .docx.

Refs #1256: mu-link latency (manual done; MIDI due-time part still needs hardware)
Version: v1.1.0.1409

Co-Authored-By: Claude Sonnet 5.5 <noreply@anthropic.com>
</commit_message>
<xml_diff>
--- a/docs/mu-link/mu-link User Manual.docx
+++ b/docs/mu-link/mu-link User Manual.docx
@@ -373,6 +373,92 @@
     </w:p>
     <w:p>
       <w:pPr>
+        <w:pStyle w:val="Heading2"/>
+      </w:pPr>
+      <w:r>
+        <w:t>Latency and the Dropouts Lamp</w:t>
+      </w:r>
+    </w:p>
+    <w:p>
+      <w:r>
+        <w:t>Each connected app renders its audio a little ahead of time, so that a momentary slowdown in one app never glitches the mix. The Latency setting decides how far ahead. A shorter lead means less delay between an app and what you hear; a longer lead gives the apps more safety margin.</w:t>
+      </w:r>
+    </w:p>
+    <w:p>
+      <w:r>
+        <w:t>To change it, open Settings (the gear button) and look in the Clients section.</w:t>
+      </w:r>
+    </w:p>
+    <w:p>
+      <w:pPr>
+        <w:pStyle w:val="ListBullet"/>
+      </w:pPr>
+      <w:r>
+        <w:t>Latency — Low, Normal or High. Low is about 43 milliseconds at 48 kHz, Normal about 85 milliseconds, High about 171 milliseconds (2048, 4096 and 8192 frames). Default: Normal. The setting applies to every connected app at once, and to any app that connects later. mu-link remembers it between sessions.</w:t>
+      </w:r>
+    </w:p>
+    <w:p>
+      <w:r>
+        <w:t>Start with Normal. If you want the tightest response and your computer copes, try Low. If you hear dropouts or clicks from an app, raise Latency to High.</w:t>
+      </w:r>
+    </w:p>
+    <w:p>
+      <w:r>
+        <w:t>Each app's strip also has a Dropouts lamp. It tells you when that app could not keep up and mu-link had to fill the gap with silence.</w:t>
+      </w:r>
+    </w:p>
+    <w:p>
+      <w:pPr>
+        <w:pStyle w:val="ListBullet"/>
+      </w:pPr>
+      <w:r>
+        <w:t>Dark — no dropouts.</w:t>
+      </w:r>
+    </w:p>
+    <w:p>
+      <w:pPr>
+        <w:pStyle w:val="ListBullet"/>
+      </w:pPr>
+      <w:r>
+        <w:t>Red — a dropout has just happened.</w:t>
+      </w:r>
+    </w:p>
+    <w:p>
+      <w:pPr>
+        <w:pStyle w:val="ListBullet"/>
+      </w:pPr>
+      <w:r>
+        <w:t>Amber — a dropout happened a little while ago and the lamp is holding the warning. Click the lamp to clear it.</w:t>
+      </w:r>
+    </w:p>
+    <w:p>
+      <w:r>
+        <w:t>A dropout in the first second after an app connects is normal and does not light the lamp. Changing Latency clears the lamps, because the old warnings no longer apply. Hover over a lit lamp and the status bar suggests raising Latency.</w:t>
+      </w:r>
+    </w:p>
+    <w:p>
+      <w:r>
+        <w:t>One caution: if your audio device uses a very large buffer, Normal leaves the apps little safety margin. If an app still drops out with a large buffer, choose High.</w:t>
+      </w:r>
+    </w:p>
+    <w:p>
+      <w:r>
+        <w:rPr>
+          <w:i/>
+        </w:rPr>
+        <w:t>[Screenshot: Settings page, Clients section, showing the Latency choice.]</w:t>
+      </w:r>
+    </w:p>
+    <w:p>
+      <w:r>
+        <w:rPr>
+          <w:i/>
+        </w:rPr>
+        <w:t>[Screenshot: Mixer strip with the Dropouts lamp lit amber.]</w:t>
+      </w:r>
+    </w:p>
+    <w:p>
+      <w:pPr>
         <w:pStyle w:val="Heading1"/>
       </w:pPr>
       <w:r>
@@ -613,6 +699,14 @@
         <w:pStyle w:val="ListBullet"/>
       </w:pPr>
       <w:r>
+        <w:t>An app crackles or drops out — look at its Dropouts lamp. If it lights, open Settings, go to Clients and raise Latency (Low, Normal, High). Use High if your audio device uses a very large buffer.</w:t>
+      </w:r>
+    </w:p>
+    <w:p>
+      <w:pPr>
+        <w:pStyle w:val="ListBullet"/>
+      </w:pPr>
+      <w:r>
         <w:t>Nothing happens / conflict — make sure only one audio server is running. Two at once share the same connection points and will conflict.</w:t>
       </w:r>
     </w:p>
@@ -670,6 +764,14 @@
       </w:pPr>
       <w:r>
         <w:t>Mixer: per-app gain, mute, solo; master gain with a safety limiter; live metering per app and on the master.</w:t>
+      </w:r>
+    </w:p>
+    <w:p>
+      <w:pPr>
+        <w:pStyle w:val="ListBullet"/>
+      </w:pPr>
+      <w:r>
+        <w:t>Latency: Low 2048, Normal 4096 (default) or High 8192 frames of render-ahead per app; a Dropouts lamp on each app strip.</w:t>
       </w:r>
     </w:p>
     <w:p>
@@ -708,7 +810,7 @@
   <w:abstractNum w:abstractNumId="0" w15:restartNumberingAfterBreak="0">
     <w:nsid w:val="FFFFFF89"/>
     <w:multiLevelType w:val="singleLevel"/>
-    <w:tmpl w:val="0C241EAA"/>
+    <w:tmpl w:val="D0D40D0E"/>
     <w:lvl w:ilvl="0">
       <w:start w:val="1"/>
       <w:numFmt w:val="bullet"/>
@@ -726,7 +828,7 @@
       </w:rPr>
     </w:lvl>
   </w:abstractNum>
-  <w:num w:numId="1" w16cid:durableId="300111967">
+  <w:num w:numId="1" w16cid:durableId="650988771">
     <w:abstractNumId w:val="0"/>
   </w:num>
 </w:numbering>
@@ -1140,7 +1242,7 @@
     <w:link w:val="Heading1Char"/>
     <w:uiPriority w:val="9"/>
     <w:qFormat/>
-    <w:rsid w:val="00242878"/>
+    <w:rsid w:val="00924935"/>
     <w:pPr>
       <w:keepNext/>
       <w:keepLines/>
@@ -1162,7 +1264,7 @@
     <w:uiPriority w:val="9"/>
     <w:unhideWhenUsed/>
     <w:qFormat/>
-    <w:rsid w:val="00242878"/>
+    <w:rsid w:val="00924935"/>
     <w:pPr>
       <w:keepNext/>
       <w:keepLines/>
@@ -1185,7 +1287,7 @@
     <w:semiHidden/>
     <w:unhideWhenUsed/>
     <w:qFormat/>
-    <w:rsid w:val="00242878"/>
+    <w:rsid w:val="00924935"/>
     <w:pPr>
       <w:keepNext/>
       <w:keepLines/>
@@ -1208,7 +1310,7 @@
     <w:semiHidden/>
     <w:unhideWhenUsed/>
     <w:qFormat/>
-    <w:rsid w:val="00242878"/>
+    <w:rsid w:val="00924935"/>
     <w:pPr>
       <w:keepNext/>
       <w:keepLines/>
@@ -1231,7 +1333,7 @@
     <w:semiHidden/>
     <w:unhideWhenUsed/>
     <w:qFormat/>
-    <w:rsid w:val="00242878"/>
+    <w:rsid w:val="00924935"/>
     <w:pPr>
       <w:keepNext/>
       <w:keepLines/>
@@ -1252,7 +1354,7 @@
     <w:semiHidden/>
     <w:unhideWhenUsed/>
     <w:qFormat/>
-    <w:rsid w:val="00242878"/>
+    <w:rsid w:val="00924935"/>
     <w:pPr>
       <w:keepNext/>
       <w:keepLines/>
@@ -1275,7 +1377,7 @@
     <w:semiHidden/>
     <w:unhideWhenUsed/>
     <w:qFormat/>
-    <w:rsid w:val="00242878"/>
+    <w:rsid w:val="00924935"/>
     <w:pPr>
       <w:keepNext/>
       <w:keepLines/>
@@ -1296,7 +1398,7 @@
     <w:semiHidden/>
     <w:unhideWhenUsed/>
     <w:qFormat/>
-    <w:rsid w:val="00242878"/>
+    <w:rsid w:val="00924935"/>
     <w:pPr>
       <w:keepNext/>
       <w:keepLines/>
@@ -1319,7 +1421,7 @@
     <w:semiHidden/>
     <w:unhideWhenUsed/>
     <w:qFormat/>
-    <w:rsid w:val="00242878"/>
+    <w:rsid w:val="00924935"/>
     <w:pPr>
       <w:keepNext/>
       <w:keepLines/>
@@ -1363,7 +1465,7 @@
     <w:basedOn w:val="DefaultParagraphFont"/>
     <w:link w:val="Heading1"/>
     <w:uiPriority w:val="9"/>
-    <w:rsid w:val="00242878"/>
+    <w:rsid w:val="00924935"/>
     <w:rPr>
       <w:rFonts w:asciiTheme="majorHAnsi" w:eastAsiaTheme="majorEastAsia" w:hAnsiTheme="majorHAnsi" w:cstheme="majorBidi"/>
       <w:color w:val="0F4761" w:themeColor="accent1" w:themeShade="BF"/>
@@ -1376,7 +1478,7 @@
     <w:basedOn w:val="DefaultParagraphFont"/>
     <w:link w:val="Heading2"/>
     <w:uiPriority w:val="9"/>
-    <w:rsid w:val="00242878"/>
+    <w:rsid w:val="00924935"/>
     <w:rPr>
       <w:rFonts w:asciiTheme="majorHAnsi" w:eastAsiaTheme="majorEastAsia" w:hAnsiTheme="majorHAnsi" w:cstheme="majorBidi"/>
       <w:color w:val="0F4761" w:themeColor="accent1" w:themeShade="BF"/>
@@ -1390,7 +1492,7 @@
     <w:link w:val="Heading3"/>
     <w:uiPriority w:val="9"/>
     <w:semiHidden/>
-    <w:rsid w:val="00242878"/>
+    <w:rsid w:val="00924935"/>
     <w:rPr>
       <w:rFonts w:eastAsiaTheme="majorEastAsia" w:cstheme="majorBidi"/>
       <w:color w:val="0F4761" w:themeColor="accent1" w:themeShade="BF"/>
@@ -1404,7 +1506,7 @@
     <w:link w:val="Heading4"/>
     <w:uiPriority w:val="9"/>
     <w:semiHidden/>
-    <w:rsid w:val="00242878"/>
+    <w:rsid w:val="00924935"/>
     <w:rPr>
       <w:rFonts w:eastAsiaTheme="majorEastAsia" w:cstheme="majorBidi"/>
       <w:i/>
@@ -1418,7 +1520,7 @@
     <w:link w:val="Heading5"/>
     <w:uiPriority w:val="9"/>
     <w:semiHidden/>
-    <w:rsid w:val="00242878"/>
+    <w:rsid w:val="00924935"/>
     <w:rPr>
       <w:rFonts w:eastAsiaTheme="majorEastAsia" w:cstheme="majorBidi"/>
       <w:color w:val="0F4761" w:themeColor="accent1" w:themeShade="BF"/>
@@ -1430,7 +1532,7 @@
     <w:link w:val="Heading6"/>
     <w:uiPriority w:val="9"/>
     <w:semiHidden/>
-    <w:rsid w:val="00242878"/>
+    <w:rsid w:val="00924935"/>
     <w:rPr>
       <w:rFonts w:eastAsiaTheme="majorEastAsia" w:cstheme="majorBidi"/>
       <w:i/>
@@ -1444,7 +1546,7 @@
     <w:link w:val="Heading7"/>
     <w:uiPriority w:val="9"/>
     <w:semiHidden/>
-    <w:rsid w:val="00242878"/>
+    <w:rsid w:val="00924935"/>
     <w:rPr>
       <w:rFonts w:eastAsiaTheme="majorEastAsia" w:cstheme="majorBidi"/>
       <w:color w:val="595959" w:themeColor="text1" w:themeTint="A6"/>
@@ -1456,7 +1558,7 @@
     <w:link w:val="Heading8"/>
     <w:uiPriority w:val="9"/>
     <w:semiHidden/>
-    <w:rsid w:val="00242878"/>
+    <w:rsid w:val="00924935"/>
     <w:rPr>
       <w:rFonts w:eastAsiaTheme="majorEastAsia" w:cstheme="majorBidi"/>
       <w:i/>
@@ -1470,7 +1572,7 @@
     <w:link w:val="Heading9"/>
     <w:uiPriority w:val="9"/>
     <w:semiHidden/>
-    <w:rsid w:val="00242878"/>
+    <w:rsid w:val="00924935"/>
     <w:rPr>
       <w:rFonts w:eastAsiaTheme="majorEastAsia" w:cstheme="majorBidi"/>
       <w:color w:val="272727" w:themeColor="text1" w:themeTint="D8"/>
@@ -1483,7 +1585,7 @@
     <w:link w:val="TitleChar"/>
     <w:uiPriority w:val="10"/>
     <w:qFormat/>
-    <w:rsid w:val="00242878"/>
+    <w:rsid w:val="00924935"/>
     <w:pPr>
       <w:spacing w:after="80" w:line="240" w:lineRule="auto"/>
       <w:contextualSpacing/>
@@ -1501,7 +1603,7 @@
     <w:basedOn w:val="DefaultParagraphFont"/>
     <w:link w:val="Title"/>
     <w:uiPriority w:val="10"/>
-    <w:rsid w:val="00242878"/>
+    <w:rsid w:val="00924935"/>
     <w:rPr>
       <w:rFonts w:asciiTheme="majorHAnsi" w:eastAsiaTheme="majorEastAsia" w:hAnsiTheme="majorHAnsi" w:cstheme="majorBidi"/>
       <w:spacing w:val="-10"/>
@@ -1517,7 +1619,7 @@
     <w:link w:val="SubtitleChar"/>
     <w:uiPriority w:val="11"/>
     <w:qFormat/>
-    <w:rsid w:val="00242878"/>
+    <w:rsid w:val="00924935"/>
     <w:pPr>
       <w:numPr>
         <w:ilvl w:val="1"/>
@@ -1536,7 +1638,7 @@
     <w:basedOn w:val="DefaultParagraphFont"/>
     <w:link w:val="Subtitle"/>
     <w:uiPriority w:val="11"/>
-    <w:rsid w:val="00242878"/>
+    <w:rsid w:val="00924935"/>
     <w:rPr>
       <w:rFonts w:eastAsiaTheme="majorEastAsia" w:cstheme="majorBidi"/>
       <w:color w:val="595959" w:themeColor="text1" w:themeTint="A6"/>
@@ -1552,7 +1654,7 @@
     <w:link w:val="QuoteChar"/>
     <w:uiPriority w:val="29"/>
     <w:qFormat/>
-    <w:rsid w:val="00242878"/>
+    <w:rsid w:val="00924935"/>
     <w:pPr>
       <w:spacing w:before="160"/>
       <w:jc w:val="center"/>
@@ -1568,7 +1670,7 @@
     <w:basedOn w:val="DefaultParagraphFont"/>
     <w:link w:val="Quote"/>
     <w:uiPriority w:val="29"/>
-    <w:rsid w:val="00242878"/>
+    <w:rsid w:val="00924935"/>
     <w:rPr>
       <w:i/>
       <w:iCs/>
@@ -1580,7 +1682,7 @@
     <w:basedOn w:val="Normal"/>
     <w:uiPriority w:val="34"/>
     <w:qFormat/>
-    <w:rsid w:val="00242878"/>
+    <w:rsid w:val="00924935"/>
     <w:pPr>
       <w:ind w:left="720"/>
       <w:contextualSpacing/>
@@ -1591,7 +1693,7 @@
     <w:basedOn w:val="DefaultParagraphFont"/>
     <w:uiPriority w:val="21"/>
     <w:qFormat/>
-    <w:rsid w:val="00242878"/>
+    <w:rsid w:val="00924935"/>
     <w:rPr>
       <w:i/>
       <w:iCs/>
@@ -1605,7 +1707,7 @@
     <w:link w:val="IntenseQuoteChar"/>
     <w:uiPriority w:val="30"/>
     <w:qFormat/>
-    <w:rsid w:val="00242878"/>
+    <w:rsid w:val="00924935"/>
     <w:pPr>
       <w:pBdr>
         <w:top w:val="single" w:sz="4" w:space="10" w:color="0F4761" w:themeColor="accent1" w:themeShade="BF"/>
@@ -1626,7 +1728,7 @@
     <w:basedOn w:val="DefaultParagraphFont"/>
     <w:link w:val="IntenseQuote"/>
     <w:uiPriority w:val="30"/>
-    <w:rsid w:val="00242878"/>
+    <w:rsid w:val="00924935"/>
     <w:rPr>
       <w:i/>
       <w:iCs/>
@@ -1638,7 +1740,7 @@
     <w:basedOn w:val="DefaultParagraphFont"/>
     <w:uiPriority w:val="32"/>
     <w:qFormat/>
-    <w:rsid w:val="00242878"/>
+    <w:rsid w:val="00924935"/>
     <w:rPr>
       <w:b/>
       <w:bCs/>
@@ -1652,7 +1754,7 @@
     <w:basedOn w:val="Normal"/>
     <w:uiPriority w:val="99"/>
     <w:unhideWhenUsed/>
-    <w:rsid w:val="00242878"/>
+    <w:rsid w:val="00924935"/>
     <w:pPr>
       <w:numPr>
         <w:numId w:val="1"/>

</xml_diff>

<commit_message>
Stage G: mu-link manual updated for the Settings page, clock lamp and sync offset
Chapters 4, 5, 6, 9 to 12 no longer describe an Audio Setup panel; the clock
switch reads Internal | MIDI In; Clock lamp and Sync offset documented; clean
Dropouts lamp wording corrected. Captures still to take.

Refs #1589: text done, screenshots outstanding
Version: v1.1.0.1409

Co-Authored-By: Claude Sonnet 5.5 <noreply@anthropic.com>
</commit_message>
<xml_diff>
--- a/docs/mu-link/mu-link User Manual.docx
+++ b/docs/mu-link/mu-link User Manual.docx
@@ -69,7 +69,7 @@
         <w:rPr>
           <w:i/>
         </w:rPr>
-        <w:t>[Screenshot: mu-link window: device picker on the left, transport and clock controls, and the client meter strip.]</w:t>
+        <w:t>[Screenshot: mu-link window: transport bar with the clock-source switch along the top, the Clients mixer strips, and the Scenes panel below.]</w:t>
       </w:r>
     </w:p>
     <w:p>
@@ -123,28 +123,36 @@
     </w:p>
     <w:p>
       <w:r>
-        <w:t>The mu-link window has two areas:</w:t>
-      </w:r>
-    </w:p>
-    <w:p>
-      <w:pPr>
-        <w:pStyle w:val="ListBullet"/>
-      </w:pPr>
-      <w:r>
-        <w:t>Audio Setup (left) — the device picker: output device, sample rate, buffer size, and MIDI input/output selection.</w:t>
-      </w:r>
-    </w:p>
-    <w:p>
-      <w:pPr>
-        <w:pStyle w:val="ListBullet"/>
-      </w:pPr>
-      <w:r>
-        <w:t>Bus (right) — the master transport, the clock-source toggle, the master tempo, and a mixer-style strip with one meter per connected app plus the summed Master.</w:t>
-      </w:r>
-    </w:p>
-    <w:p>
-      <w:r>
-        <w:t>The window is resizable.</w:t>
+        <w:t>The mu-link window has three parts:</w:t>
+      </w:r>
+    </w:p>
+    <w:p>
+      <w:pPr>
+        <w:pStyle w:val="ListBullet"/>
+      </w:pPr>
+      <w:r>
+        <w:t>Transport bar (top) — the mu-link logo, Play / Stop, the master tempo, the position readout, the clock-source switch (Internal or MIDI In), the preset menu with New and Save, and the gear button that opens Settings.</w:t>
+      </w:r>
+    </w:p>
+    <w:p>
+      <w:pPr>
+        <w:pStyle w:val="ListBullet"/>
+      </w:pPr>
+      <w:r>
+        <w:t>Clients mixer (middle) — one strip for each connected app, plus the Master strip and its two inserts on the right.</w:t>
+      </w:r>
+    </w:p>
+    <w:p>
+      <w:pPr>
+        <w:pStyle w:val="ListBullet"/>
+      </w:pPr>
+      <w:r>
+        <w:t>Scenes panel (bottom) — eight scenes that send program changes to your connected apps.</w:t>
+      </w:r>
+    </w:p>
+    <w:p>
+      <w:r>
+        <w:t>Audio and MIDI devices are not chosen in the main window. Click the gear to open the Settings page; the Audio / MIDI devices button on that page opens the device dialog (see Choosing an Audio Device).</w:t>
       </w:r>
     </w:p>
     <w:p>
@@ -152,7 +160,7 @@
         <w:rPr>
           <w:i/>
         </w:rPr>
-        <w:t>[Screenshot: Annotated window showing the device picker, transport row, and meter strip.]</w:t>
+        <w:t>[Screenshot: Annotated window showing the transport bar, the Clients mixer, and the Scenes panel.]</w:t>
       </w:r>
     </w:p>
     <w:p>
@@ -165,7 +173,7 @@
     </w:p>
     <w:p>
       <w:r>
-        <w:t>Use the Audio Setup panel on the left to pick the output device mu-link plays through. This is the device the whole rig is summed to.</w:t>
+        <w:t>Click the gear button at the right of the transport bar to open the Settings page. In the General group, click Choose devices... under Audio / MIDI devices. A device dialog opens. Pick the output device mu-link plays through here; this is the device the whole rig is summed to. Changes apply at once, and you can close the dialog when you are done.</w:t>
       </w:r>
     </w:p>
     <w:p>
@@ -202,7 +210,7 @@
     </w:p>
     <w:p>
       <w:r>
-        <w:t>If no device opens at launch (for example the default is in use), just pick a working one here — mu-link starts driving the bus as soon as a device opens; no restart is needed.</w:t>
+        <w:t>If no device opens at launch (for example the default is in use), just pick a working one in the device dialog — mu-link starts driving the bus as soon as a device opens; no restart is needed.</w:t>
       </w:r>
     </w:p>
     <w:p>
@@ -210,7 +218,15 @@
         <w:rPr>
           <w:i/>
         </w:rPr>
-        <w:t>[Screenshot: Audio Setup panel with an output device and a MIDI input selected.]</w:t>
+        <w:t>[Screenshot: Settings page, General group, with the Choose devices... button.]</w:t>
+      </w:r>
+    </w:p>
+    <w:p>
+      <w:r>
+        <w:rPr>
+          <w:i/>
+        </w:rPr>
+        <w:t>[Screenshot: Audio / MIDI device dialog with an output device and a MIDI input selected.]</w:t>
       </w:r>
     </w:p>
     <w:p>
@@ -292,7 +308,7 @@
     </w:p>
     <w:p>
       <w:r>
-        <w:t>mu-link's own MIDI output, chosen in Audio Setup, carries only MIDI clock and transport messages (see MIDI Clock Out). Give mu-Clid a different MIDI output port, because many Windows MIDI ports can be opened by only one application at a time.</w:t>
+        <w:t>mu-link's own MIDI output, chosen in the Audio / MIDI devices dialog, carries only MIDI clock and transport messages (see MIDI Clock Out). Give mu-Clid a different MIDI output port, because many Windows MIDI ports can be opened by only one application at a time.</w:t>
       </w:r>
     </w:p>
     <w:p>
@@ -412,7 +428,7 @@
         <w:pStyle w:val="ListBullet"/>
       </w:pPr>
       <w:r>
-        <w:t>Dark — no dropouts.</w:t>
+        <w:t>Unlit — no dropouts. Hover over it and the status bar reads No dropouts.</w:t>
       </w:r>
     </w:p>
     <w:p>
@@ -517,15 +533,15 @@
         <w:pStyle w:val="ListBullet"/>
       </w:pPr>
       <w:r>
-        <w:t>In Audio Setup, enable the MIDI input port that carries the external clock.</w:t>
-      </w:r>
-    </w:p>
-    <w:p>
-      <w:pPr>
-        <w:pStyle w:val="ListBullet"/>
-      </w:pPr>
-      <w:r>
-        <w:t>Set the clock-source toggle in the transport row to Ext MIDI (it reads 'Clock: Internal' by default; click to switch to 'Clock: Ext MIDI').</w:t>
+        <w:t>Open Settings (the gear button), click Choose devices... under Audio / MIDI devices, and enable the MIDI input port that carries the external clock.</w:t>
+      </w:r>
+    </w:p>
+    <w:p>
+      <w:pPr>
+        <w:pStyle w:val="ListBullet"/>
+      </w:pPr>
+      <w:r>
+        <w:t>Set the clock-source switch on the transport bar to MIDI In (it offers Internal and MIDI In, and starts on Internal).</w:t>
       </w:r>
     </w:p>
     <w:p>
@@ -539,6 +555,16 @@
     <w:p>
       <w:r>
         <w:t>mu-link also follows Song Position Pointer messages while the external device is stopped. Move the external playhead, press Continue, and the whole rig picks up from the new position.</w:t>
+      </w:r>
+    </w:p>
+    <w:p>
+      <w:r>
+        <w:t>While MIDI In is selected, a Clock lamp appears next to the tempo. Amber means mu-link is waiting for clock or still re-aligning, green means it is locked to the external tempo, and red means the clock stopped and the transport has stopped. Hover over the lamp and the status bar says which.</w:t>
+      </w:r>
+    </w:p>
+    <w:p>
+      <w:r>
+        <w:t>If the external clock arrives late or early against your audio, use Sync offset on the Settings page to nudge it (-50 to +250 milliseconds, default 0).</w:t>
       </w:r>
     </w:p>
     <w:p>
@@ -564,7 +590,7 @@
         <w:rPr>
           <w:i/>
         </w:rPr>
-        <w:t>[Screenshot: Transport row with the clock-source toggle set to Ext MIDI and a detected BPM shown.]</w:t>
+        <w:t>[Screenshot: Transport bar with the clock-source switch set to MIDI In, the Clock lamp green, and a detected BPM shown.]</w:t>
       </w:r>
     </w:p>
     <w:p>
@@ -577,7 +603,7 @@
     </w:p>
     <w:p>
       <w:r>
-        <w:t>mu-link can also send MIDI clock OUT, so outboard hardware (a delay pedal, a sequencer, a drum machine) locks to mu-link's tempo. Choose a MIDI output port in Audio Setup; mu-link emits standard 24-ppqn MIDI clock derived from its master clock. The clock pulses are evenly spaced at their exact times, not bunched together, so outboard gear reads a steady tempo. This works whether mu-link is the master (Internal) or itself slaved to an external clock (Ext MIDI) — in either case the outbound clock follows mu-link's transport.</w:t>
+        <w:t>mu-link can also send MIDI clock OUT, so outboard hardware (a delay pedal, a sequencer, a drum machine) locks to mu-link's tempo. Choose a MIDI output port in the Audio / MIDI devices dialog (Settings, then Choose devices...); mu-link emits standard 24-ppqn MIDI clock derived from its master clock. The clock pulses are evenly spaced at their exact times, not bunched together, so outboard gear reads a steady tempo. This works whether mu-link is the master (Internal) or itself slaved to an external clock (MIDI In) — in either case the outbound clock follows mu-link's transport.</w:t>
       </w:r>
     </w:p>
     <w:p>
@@ -635,15 +661,15 @@
         <w:pStyle w:val="ListBullet"/>
       </w:pPr>
       <w:r>
-        <w:t>Lowest latency: choose a WASAPI Exclusive or ASIO output and a small buffer size in Audio Setup.</w:t>
-      </w:r>
-    </w:p>
-    <w:p>
-      <w:pPr>
-        <w:pStyle w:val="ListBullet"/>
-      </w:pPr>
-      <w:r>
-        <w:t>Slave to your groovebox: enable its MIDI port, switch the clock source to Ext MIDI, and hit play on the groovebox — the whole mu rig follows.</w:t>
+        <w:t>Lowest latency: choose a WASAPI Exclusive or ASIO output and a small buffer size in the Audio / MIDI devices dialog (Settings, then Choose devices...).</w:t>
+      </w:r>
+    </w:p>
+    <w:p>
+      <w:pPr>
+        <w:pStyle w:val="ListBullet"/>
+      </w:pPr>
+      <w:r>
+        <w:t>Slave to your groovebox: enable its MIDI port, switch the clock source to MIDI In, and hit play on the groovebox — the whole mu rig follows.</w:t>
       </w:r>
     </w:p>
     <w:p>
@@ -675,23 +701,23 @@
         <w:pStyle w:val="ListBullet"/>
       </w:pPr>
       <w:r>
-        <w:t>An app does not connect — make sure mu-link is running and has an open audio device (pick one in Audio Setup). Apps only attach once mu-link has a working output. Also confirm you are running the STANDALONE app, not the plug-in.</w:t>
-      </w:r>
-    </w:p>
-    <w:p>
-      <w:pPr>
-        <w:pStyle w:val="ListBullet"/>
-      </w:pPr>
-      <w:r>
-        <w:t>No sound — check the output device in Audio Setup, the Master gain, and that the connected app is actually producing sound (and is not muted in its strip).</w:t>
-      </w:r>
-    </w:p>
-    <w:p>
-      <w:pPr>
-        <w:pStyle w:val="ListBullet"/>
-      </w:pPr>
-      <w:r>
-        <w:t>External clock not followed — confirm the correct MIDI input is enabled, the clock-source toggle is set to Ext MIDI, and the external device is sending clock (start it playing).</w:t>
+        <w:t>An app does not connect — make sure mu-link is running and has an open audio device (open Settings and use Choose devices... to pick one). Apps only attach once mu-link has a working output. Also confirm you are running the STANDALONE app, not the plug-in.</w:t>
+      </w:r>
+    </w:p>
+    <w:p>
+      <w:pPr>
+        <w:pStyle w:val="ListBullet"/>
+      </w:pPr>
+      <w:r>
+        <w:t>No sound — check the output device in the Audio / MIDI devices dialog, the Master gain, and that the connected app is actually producing sound (and is not muted in its strip).</w:t>
+      </w:r>
+    </w:p>
+    <w:p>
+      <w:pPr>
+        <w:pStyle w:val="ListBullet"/>
+      </w:pPr>
+      <w:r>
+        <w:t>External clock not followed — confirm the correct MIDI input is enabled, the clock-source switch is set to MIDI In, and the external device is sending clock (start it playing).</w:t>
       </w:r>
     </w:p>
     <w:p>
@@ -747,7 +773,7 @@
         <w:pStyle w:val="ListBullet"/>
       </w:pPr>
       <w:r>
-        <w:t>Clock: sample-accurate master derived from the audio device; Internal (master) or External MIDI (slave) source.</w:t>
+        <w:t>Clock: sample-accurate master derived from the audio device; Internal (master) or MIDI In (slave) source.</w:t>
       </w:r>
     </w:p>
     <w:p>
@@ -810,7 +836,7 @@
   <w:abstractNum w:abstractNumId="0" w15:restartNumberingAfterBreak="0">
     <w:nsid w:val="FFFFFF89"/>
     <w:multiLevelType w:val="singleLevel"/>
-    <w:tmpl w:val="D0D40D0E"/>
+    <w:tmpl w:val="F62446EC"/>
     <w:lvl w:ilvl="0">
       <w:start w:val="1"/>
       <w:numFmt w:val="bullet"/>
@@ -828,7 +854,7 @@
       </w:rPr>
     </w:lvl>
   </w:abstractNum>
-  <w:num w:numId="1" w16cid:durableId="650988771">
+  <w:num w:numId="1" w16cid:durableId="2003703578">
     <w:abstractNumId w:val="0"/>
   </w:num>
 </w:numbering>
@@ -1242,7 +1268,7 @@
     <w:link w:val="Heading1Char"/>
     <w:uiPriority w:val="9"/>
     <w:qFormat/>
-    <w:rsid w:val="00924935"/>
+    <w:rsid w:val="00335322"/>
     <w:pPr>
       <w:keepNext/>
       <w:keepLines/>
@@ -1264,7 +1290,7 @@
     <w:uiPriority w:val="9"/>
     <w:unhideWhenUsed/>
     <w:qFormat/>
-    <w:rsid w:val="00924935"/>
+    <w:rsid w:val="00335322"/>
     <w:pPr>
       <w:keepNext/>
       <w:keepLines/>
@@ -1287,7 +1313,7 @@
     <w:semiHidden/>
     <w:unhideWhenUsed/>
     <w:qFormat/>
-    <w:rsid w:val="00924935"/>
+    <w:rsid w:val="00335322"/>
     <w:pPr>
       <w:keepNext/>
       <w:keepLines/>
@@ -1310,7 +1336,7 @@
     <w:semiHidden/>
     <w:unhideWhenUsed/>
     <w:qFormat/>
-    <w:rsid w:val="00924935"/>
+    <w:rsid w:val="00335322"/>
     <w:pPr>
       <w:keepNext/>
       <w:keepLines/>
@@ -1333,7 +1359,7 @@
     <w:semiHidden/>
     <w:unhideWhenUsed/>
     <w:qFormat/>
-    <w:rsid w:val="00924935"/>
+    <w:rsid w:val="00335322"/>
     <w:pPr>
       <w:keepNext/>
       <w:keepLines/>
@@ -1354,7 +1380,7 @@
     <w:semiHidden/>
     <w:unhideWhenUsed/>
     <w:qFormat/>
-    <w:rsid w:val="00924935"/>
+    <w:rsid w:val="00335322"/>
     <w:pPr>
       <w:keepNext/>
       <w:keepLines/>
@@ -1377,7 +1403,7 @@
     <w:semiHidden/>
     <w:unhideWhenUsed/>
     <w:qFormat/>
-    <w:rsid w:val="00924935"/>
+    <w:rsid w:val="00335322"/>
     <w:pPr>
       <w:keepNext/>
       <w:keepLines/>
@@ -1398,7 +1424,7 @@
     <w:semiHidden/>
     <w:unhideWhenUsed/>
     <w:qFormat/>
-    <w:rsid w:val="00924935"/>
+    <w:rsid w:val="00335322"/>
     <w:pPr>
       <w:keepNext/>
       <w:keepLines/>
@@ -1421,7 +1447,7 @@
     <w:semiHidden/>
     <w:unhideWhenUsed/>
     <w:qFormat/>
-    <w:rsid w:val="00924935"/>
+    <w:rsid w:val="00335322"/>
     <w:pPr>
       <w:keepNext/>
       <w:keepLines/>
@@ -1465,7 +1491,7 @@
     <w:basedOn w:val="DefaultParagraphFont"/>
     <w:link w:val="Heading1"/>
     <w:uiPriority w:val="9"/>
-    <w:rsid w:val="00924935"/>
+    <w:rsid w:val="00335322"/>
     <w:rPr>
       <w:rFonts w:asciiTheme="majorHAnsi" w:eastAsiaTheme="majorEastAsia" w:hAnsiTheme="majorHAnsi" w:cstheme="majorBidi"/>
       <w:color w:val="0F4761" w:themeColor="accent1" w:themeShade="BF"/>
@@ -1478,7 +1504,7 @@
     <w:basedOn w:val="DefaultParagraphFont"/>
     <w:link w:val="Heading2"/>
     <w:uiPriority w:val="9"/>
-    <w:rsid w:val="00924935"/>
+    <w:rsid w:val="00335322"/>
     <w:rPr>
       <w:rFonts w:asciiTheme="majorHAnsi" w:eastAsiaTheme="majorEastAsia" w:hAnsiTheme="majorHAnsi" w:cstheme="majorBidi"/>
       <w:color w:val="0F4761" w:themeColor="accent1" w:themeShade="BF"/>
@@ -1492,7 +1518,7 @@
     <w:link w:val="Heading3"/>
     <w:uiPriority w:val="9"/>
     <w:semiHidden/>
-    <w:rsid w:val="00924935"/>
+    <w:rsid w:val="00335322"/>
     <w:rPr>
       <w:rFonts w:eastAsiaTheme="majorEastAsia" w:cstheme="majorBidi"/>
       <w:color w:val="0F4761" w:themeColor="accent1" w:themeShade="BF"/>
@@ -1506,7 +1532,7 @@
     <w:link w:val="Heading4"/>
     <w:uiPriority w:val="9"/>
     <w:semiHidden/>
-    <w:rsid w:val="00924935"/>
+    <w:rsid w:val="00335322"/>
     <w:rPr>
       <w:rFonts w:eastAsiaTheme="majorEastAsia" w:cstheme="majorBidi"/>
       <w:i/>
@@ -1520,7 +1546,7 @@
     <w:link w:val="Heading5"/>
     <w:uiPriority w:val="9"/>
     <w:semiHidden/>
-    <w:rsid w:val="00924935"/>
+    <w:rsid w:val="00335322"/>
     <w:rPr>
       <w:rFonts w:eastAsiaTheme="majorEastAsia" w:cstheme="majorBidi"/>
       <w:color w:val="0F4761" w:themeColor="accent1" w:themeShade="BF"/>
@@ -1532,7 +1558,7 @@
     <w:link w:val="Heading6"/>
     <w:uiPriority w:val="9"/>
     <w:semiHidden/>
-    <w:rsid w:val="00924935"/>
+    <w:rsid w:val="00335322"/>
     <w:rPr>
       <w:rFonts w:eastAsiaTheme="majorEastAsia" w:cstheme="majorBidi"/>
       <w:i/>
@@ -1546,7 +1572,7 @@
     <w:link w:val="Heading7"/>
     <w:uiPriority w:val="9"/>
     <w:semiHidden/>
-    <w:rsid w:val="00924935"/>
+    <w:rsid w:val="00335322"/>
     <w:rPr>
       <w:rFonts w:eastAsiaTheme="majorEastAsia" w:cstheme="majorBidi"/>
       <w:color w:val="595959" w:themeColor="text1" w:themeTint="A6"/>
@@ -1558,7 +1584,7 @@
     <w:link w:val="Heading8"/>
     <w:uiPriority w:val="9"/>
     <w:semiHidden/>
-    <w:rsid w:val="00924935"/>
+    <w:rsid w:val="00335322"/>
     <w:rPr>
       <w:rFonts w:eastAsiaTheme="majorEastAsia" w:cstheme="majorBidi"/>
       <w:i/>
@@ -1572,7 +1598,7 @@
     <w:link w:val="Heading9"/>
     <w:uiPriority w:val="9"/>
     <w:semiHidden/>
-    <w:rsid w:val="00924935"/>
+    <w:rsid w:val="00335322"/>
     <w:rPr>
       <w:rFonts w:eastAsiaTheme="majorEastAsia" w:cstheme="majorBidi"/>
       <w:color w:val="272727" w:themeColor="text1" w:themeTint="D8"/>
@@ -1585,7 +1611,7 @@
     <w:link w:val="TitleChar"/>
     <w:uiPriority w:val="10"/>
     <w:qFormat/>
-    <w:rsid w:val="00924935"/>
+    <w:rsid w:val="00335322"/>
     <w:pPr>
       <w:spacing w:after="80" w:line="240" w:lineRule="auto"/>
       <w:contextualSpacing/>
@@ -1603,7 +1629,7 @@
     <w:basedOn w:val="DefaultParagraphFont"/>
     <w:link w:val="Title"/>
     <w:uiPriority w:val="10"/>
-    <w:rsid w:val="00924935"/>
+    <w:rsid w:val="00335322"/>
     <w:rPr>
       <w:rFonts w:asciiTheme="majorHAnsi" w:eastAsiaTheme="majorEastAsia" w:hAnsiTheme="majorHAnsi" w:cstheme="majorBidi"/>
       <w:spacing w:val="-10"/>
@@ -1619,7 +1645,7 @@
     <w:link w:val="SubtitleChar"/>
     <w:uiPriority w:val="11"/>
     <w:qFormat/>
-    <w:rsid w:val="00924935"/>
+    <w:rsid w:val="00335322"/>
     <w:pPr>
       <w:numPr>
         <w:ilvl w:val="1"/>
@@ -1638,7 +1664,7 @@
     <w:basedOn w:val="DefaultParagraphFont"/>
     <w:link w:val="Subtitle"/>
     <w:uiPriority w:val="11"/>
-    <w:rsid w:val="00924935"/>
+    <w:rsid w:val="00335322"/>
     <w:rPr>
       <w:rFonts w:eastAsiaTheme="majorEastAsia" w:cstheme="majorBidi"/>
       <w:color w:val="595959" w:themeColor="text1" w:themeTint="A6"/>
@@ -1654,7 +1680,7 @@
     <w:link w:val="QuoteChar"/>
     <w:uiPriority w:val="29"/>
     <w:qFormat/>
-    <w:rsid w:val="00924935"/>
+    <w:rsid w:val="00335322"/>
     <w:pPr>
       <w:spacing w:before="160"/>
       <w:jc w:val="center"/>
@@ -1670,7 +1696,7 @@
     <w:basedOn w:val="DefaultParagraphFont"/>
     <w:link w:val="Quote"/>
     <w:uiPriority w:val="29"/>
-    <w:rsid w:val="00924935"/>
+    <w:rsid w:val="00335322"/>
     <w:rPr>
       <w:i/>
       <w:iCs/>
@@ -1682,7 +1708,7 @@
     <w:basedOn w:val="Normal"/>
     <w:uiPriority w:val="34"/>
     <w:qFormat/>
-    <w:rsid w:val="00924935"/>
+    <w:rsid w:val="00335322"/>
     <w:pPr>
       <w:ind w:left="720"/>
       <w:contextualSpacing/>
@@ -1693,7 +1719,7 @@
     <w:basedOn w:val="DefaultParagraphFont"/>
     <w:uiPriority w:val="21"/>
     <w:qFormat/>
-    <w:rsid w:val="00924935"/>
+    <w:rsid w:val="00335322"/>
     <w:rPr>
       <w:i/>
       <w:iCs/>
@@ -1707,7 +1733,7 @@
     <w:link w:val="IntenseQuoteChar"/>
     <w:uiPriority w:val="30"/>
     <w:qFormat/>
-    <w:rsid w:val="00924935"/>
+    <w:rsid w:val="00335322"/>
     <w:pPr>
       <w:pBdr>
         <w:top w:val="single" w:sz="4" w:space="10" w:color="0F4761" w:themeColor="accent1" w:themeShade="BF"/>
@@ -1728,7 +1754,7 @@
     <w:basedOn w:val="DefaultParagraphFont"/>
     <w:link w:val="IntenseQuote"/>
     <w:uiPriority w:val="30"/>
-    <w:rsid w:val="00924935"/>
+    <w:rsid w:val="00335322"/>
     <w:rPr>
       <w:i/>
       <w:iCs/>
@@ -1740,7 +1766,7 @@
     <w:basedOn w:val="DefaultParagraphFont"/>
     <w:uiPriority w:val="32"/>
     <w:qFormat/>
-    <w:rsid w:val="00924935"/>
+    <w:rsid w:val="00335322"/>
     <w:rPr>
       <w:b/>
       <w:bCs/>
@@ -1754,7 +1780,7 @@
     <w:basedOn w:val="Normal"/>
     <w:uiPriority w:val="99"/>
     <w:unhideWhenUsed/>
-    <w:rsid w:val="00924935"/>
+    <w:rsid w:val="00335322"/>
     <w:pPr>
       <w:numPr>
         <w:numId w:val="1"/>

</xml_diff>

<commit_message>
Stage G: mu-link manual screenshots; dialog title spacing; dropouts status text
Five captures wired into the manual (Clock lamp capture still needs a MIDI
clock source). The device dialog title keeps its space after the em dash and
the Dropouts status no longer repeats its own name.

Refs #1589: screenshots done except the Ch9 Clock lamp; user-documentation-author Pass outstanding
Version: v1.1.0.1409

Co-Authored-By: Claude Sonnet 5.5 <noreply@anthropic.com>
</commit_message>
<xml_diff>
--- a/docs/mu-link/mu-link User Manual.docx
+++ b/docs/mu-link/mu-link User Manual.docx
@@ -38,6 +38,7 @@
         <w:pStyle w:val="Heading1"/>
       </w:pPr>
       <w:r>
+        <w:lastRenderedPageBreak/>
         <w:t>1. Introduction</w:t>
       </w:r>
     </w:p>
@@ -62,6 +63,57 @@
     <w:p>
       <w:r>
         <w:t>mu-link is for performers and producers who want to run more than one mu instrument at once — for example a rhythmic mu-Clid alongside an evolving mu-Tant drone — locked tightly together and mixed to a single output, without a DAW. It is built for the stage: it can also slave the whole rig to an external MIDI clock from a drum machine, groovebox, or DAW, and send MIDI clock out to outboard gear.</w:t>
+      </w:r>
+    </w:p>
+    <w:p>
+      <w:pPr>
+        <w:jc w:val="center"/>
+      </w:pPr>
+      <w:r>
+        <w:rPr>
+          <w:noProof/>
+        </w:rPr>
+        <w:drawing>
+          <wp:inline distT="0" distB="0" distL="0" distR="0" wp14:anchorId="283B9146" wp14:editId="2B59297C">
+            <wp:extent cx="5274310" cy="4058920"/>
+            <wp:effectExtent l="0" t="0" r="2540" b="0"/>
+            <wp:docPr id="2019903596" name="Picture 1"/>
+            <wp:cNvGraphicFramePr>
+              <a:graphicFrameLocks xmlns:a="http://schemas.openxmlformats.org/drawingml/2006/main" noChangeAspect="1"/>
+            </wp:cNvGraphicFramePr>
+            <a:graphic xmlns:a="http://schemas.openxmlformats.org/drawingml/2006/main">
+              <a:graphicData uri="http://schemas.openxmlformats.org/drawingml/2006/picture">
+                <pic:pic xmlns:pic="http://schemas.openxmlformats.org/drawingml/2006/picture">
+                  <pic:nvPicPr>
+                    <pic:cNvPr id="2019903596" name=""/>
+                    <pic:cNvPicPr/>
+                  </pic:nvPicPr>
+                  <pic:blipFill>
+                    <a:blip r:embed="rId5">
+                      <a:extLst>
+                        <a:ext uri="{28A0092B-C50C-407E-A947-70E740481C1C}">
+                          <a14:useLocalDpi xmlns:a14="http://schemas.microsoft.com/office/drawing/2010/main" val="0"/>
+                        </a:ext>
+                      </a:extLst>
+                    </a:blip>
+                    <a:stretch>
+                      <a:fillRect/>
+                    </a:stretch>
+                  </pic:blipFill>
+                  <pic:spPr>
+                    <a:xfrm>
+                      <a:off x="0" y="0"/>
+                      <a:ext cx="5274310" cy="4058920"/>
+                    </a:xfrm>
+                    <a:prstGeom prst="rect">
+                      <a:avLst/>
+                    </a:prstGeom>
+                  </pic:spPr>
+                </pic:pic>
+              </a:graphicData>
+            </a:graphic>
+          </wp:inline>
+        </w:drawing>
       </w:r>
     </w:p>
     <w:p>
@@ -69,7 +121,7 @@
         <w:rPr>
           <w:i/>
         </w:rPr>
-        <w:t>[Screenshot: mu-link window: transport bar with the clock-source switch along the top, the Clients mixer strips, and the Scenes panel below.]</w:t>
+        <w:t>mu-link window: transport bar with the clock-source switch along the top, the Clients mixer strips, and the Scenes panel below.</w:t>
       </w:r>
     </w:p>
     <w:p>
@@ -77,6 +129,7 @@
         <w:pStyle w:val="Heading1"/>
       </w:pPr>
       <w:r>
+        <w:lastRenderedPageBreak/>
         <w:t>2. How It Works</w:t>
       </w:r>
     </w:p>
@@ -153,6 +206,58 @@
     <w:p>
       <w:r>
         <w:t>Audio and MIDI devices are not chosen in the main window. Click the gear to open the Settings page; the Audio / MIDI devices button on that page opens the device dialog (see Choosing an Audio Device).</w:t>
+      </w:r>
+    </w:p>
+    <w:p>
+      <w:pPr>
+        <w:jc w:val="center"/>
+      </w:pPr>
+      <w:r>
+        <w:rPr>
+          <w:noProof/>
+        </w:rPr>
+        <w:lastRenderedPageBreak/>
+        <w:drawing>
+          <wp:inline distT="0" distB="0" distL="0" distR="0" wp14:anchorId="6AE913CF" wp14:editId="7738149B">
+            <wp:extent cx="5274310" cy="4058920"/>
+            <wp:effectExtent l="0" t="0" r="2540" b="0"/>
+            <wp:docPr id="1175078515" name="Picture 2"/>
+            <wp:cNvGraphicFramePr>
+              <a:graphicFrameLocks xmlns:a="http://schemas.openxmlformats.org/drawingml/2006/main" noChangeAspect="1"/>
+            </wp:cNvGraphicFramePr>
+            <a:graphic xmlns:a="http://schemas.openxmlformats.org/drawingml/2006/main">
+              <a:graphicData uri="http://schemas.openxmlformats.org/drawingml/2006/picture">
+                <pic:pic xmlns:pic="http://schemas.openxmlformats.org/drawingml/2006/picture">
+                  <pic:nvPicPr>
+                    <pic:cNvPr id="1175078515" name=""/>
+                    <pic:cNvPicPr/>
+                  </pic:nvPicPr>
+                  <pic:blipFill>
+                    <a:blip r:embed="rId5">
+                      <a:extLst>
+                        <a:ext uri="{28A0092B-C50C-407E-A947-70E740481C1C}">
+                          <a14:useLocalDpi xmlns:a14="http://schemas.microsoft.com/office/drawing/2010/main" val="0"/>
+                        </a:ext>
+                      </a:extLst>
+                    </a:blip>
+                    <a:stretch>
+                      <a:fillRect/>
+                    </a:stretch>
+                  </pic:blipFill>
+                  <pic:spPr>
+                    <a:xfrm>
+                      <a:off x="0" y="0"/>
+                      <a:ext cx="5274310" cy="4058920"/>
+                    </a:xfrm>
+                    <a:prstGeom prst="rect">
+                      <a:avLst/>
+                    </a:prstGeom>
+                  </pic:spPr>
+                </pic:pic>
+              </a:graphicData>
+            </a:graphic>
+          </wp:inline>
+        </w:drawing>
       </w:r>
     </w:p>
     <w:p>
@@ -160,7 +265,7 @@
         <w:rPr>
           <w:i/>
         </w:rPr>
-        <w:t>[Screenshot: Annotated window showing the transport bar, the Clients mixer, and the Scenes panel.]</w:t>
+        <w:t>The window showing the transport bar, the Clients mixer, and the Scenes panel.</w:t>
       </w:r>
     </w:p>
     <w:p>
@@ -211,6 +316,58 @@
     <w:p>
       <w:r>
         <w:t>If no device opens at launch (for example the default is in use), just pick a working one in the device dialog — mu-link starts driving the bus as soon as a device opens; no restart is needed.</w:t>
+      </w:r>
+    </w:p>
+    <w:p>
+      <w:pPr>
+        <w:jc w:val="center"/>
+      </w:pPr>
+      <w:r>
+        <w:rPr>
+          <w:noProof/>
+        </w:rPr>
+        <w:lastRenderedPageBreak/>
+        <w:drawing>
+          <wp:inline distT="0" distB="0" distL="0" distR="0" wp14:anchorId="31A4108B" wp14:editId="0074134A">
+            <wp:extent cx="5145580" cy="1905770"/>
+            <wp:effectExtent l="0" t="0" r="0" b="0"/>
+            <wp:docPr id="1134791202" name="Picture 3"/>
+            <wp:cNvGraphicFramePr>
+              <a:graphicFrameLocks xmlns:a="http://schemas.openxmlformats.org/drawingml/2006/main" noChangeAspect="1"/>
+            </wp:cNvGraphicFramePr>
+            <a:graphic xmlns:a="http://schemas.openxmlformats.org/drawingml/2006/main">
+              <a:graphicData uri="http://schemas.openxmlformats.org/drawingml/2006/picture">
+                <pic:pic xmlns:pic="http://schemas.openxmlformats.org/drawingml/2006/picture">
+                  <pic:nvPicPr>
+                    <pic:cNvPr id="1134791202" name=""/>
+                    <pic:cNvPicPr/>
+                  </pic:nvPicPr>
+                  <pic:blipFill>
+                    <a:blip r:embed="rId6">
+                      <a:extLst>
+                        <a:ext uri="{28A0092B-C50C-407E-A947-70E740481C1C}">
+                          <a14:useLocalDpi xmlns:a14="http://schemas.microsoft.com/office/drawing/2010/main" val="0"/>
+                        </a:ext>
+                      </a:extLst>
+                    </a:blip>
+                    <a:stretch>
+                      <a:fillRect/>
+                    </a:stretch>
+                  </pic:blipFill>
+                  <pic:spPr>
+                    <a:xfrm>
+                      <a:off x="0" y="0"/>
+                      <a:ext cx="5145580" cy="1905770"/>
+                    </a:xfrm>
+                    <a:prstGeom prst="rect">
+                      <a:avLst/>
+                    </a:prstGeom>
+                  </pic:spPr>
+                </pic:pic>
+              </a:graphicData>
+            </a:graphic>
+          </wp:inline>
+        </w:drawing>
       </w:r>
     </w:p>
     <w:p>
@@ -218,7 +375,58 @@
         <w:rPr>
           <w:i/>
         </w:rPr>
-        <w:t>[Screenshot: Settings page, General group, with the Choose devices... button.]</w:t>
+        <w:t>Settings page, General group, with the Choose devices... button.</w:t>
+      </w:r>
+    </w:p>
+    <w:p>
+      <w:pPr>
+        <w:jc w:val="center"/>
+      </w:pPr>
+      <w:r>
+        <w:rPr>
+          <w:noProof/>
+        </w:rPr>
+        <w:drawing>
+          <wp:inline distT="0" distB="0" distL="0" distR="0" wp14:anchorId="654813E2" wp14:editId="55EDF2D2">
+            <wp:extent cx="3658111" cy="2905530"/>
+            <wp:effectExtent l="0" t="0" r="0" b="0"/>
+            <wp:docPr id="1465937797" name="Picture 4"/>
+            <wp:cNvGraphicFramePr>
+              <a:graphicFrameLocks xmlns:a="http://schemas.openxmlformats.org/drawingml/2006/main" noChangeAspect="1"/>
+            </wp:cNvGraphicFramePr>
+            <a:graphic xmlns:a="http://schemas.openxmlformats.org/drawingml/2006/main">
+              <a:graphicData uri="http://schemas.openxmlformats.org/drawingml/2006/picture">
+                <pic:pic xmlns:pic="http://schemas.openxmlformats.org/drawingml/2006/picture">
+                  <pic:nvPicPr>
+                    <pic:cNvPr id="1465937797" name=""/>
+                    <pic:cNvPicPr/>
+                  </pic:nvPicPr>
+                  <pic:blipFill>
+                    <a:blip r:embed="rId7">
+                      <a:extLst>
+                        <a:ext uri="{28A0092B-C50C-407E-A947-70E740481C1C}">
+                          <a14:useLocalDpi xmlns:a14="http://schemas.microsoft.com/office/drawing/2010/main" val="0"/>
+                        </a:ext>
+                      </a:extLst>
+                    </a:blip>
+                    <a:stretch>
+                      <a:fillRect/>
+                    </a:stretch>
+                  </pic:blipFill>
+                  <pic:spPr>
+                    <a:xfrm>
+                      <a:off x="0" y="0"/>
+                      <a:ext cx="3658111" cy="2905530"/>
+                    </a:xfrm>
+                    <a:prstGeom prst="rect">
+                      <a:avLst/>
+                    </a:prstGeom>
+                  </pic:spPr>
+                </pic:pic>
+              </a:graphicData>
+            </a:graphic>
+          </wp:inline>
+        </w:drawing>
       </w:r>
     </w:p>
     <w:p>
@@ -226,7 +434,7 @@
         <w:rPr>
           <w:i/>
         </w:rPr>
-        <w:t>[Screenshot: Audio / MIDI device dialog with an output device and a MIDI input selected.]</w:t>
+        <w:t>Audio / MIDI device dialog with an output device and a MIDI input selected.</w:t>
       </w:r>
     </w:p>
     <w:p>
@@ -279,6 +487,7 @@
         <w:pStyle w:val="Heading2"/>
       </w:pPr>
       <w:r>
+        <w:lastRenderedPageBreak/>
         <w:t>MIDI in Connected Apps</w:t>
       </w:r>
     </w:p>
@@ -392,6 +601,7 @@
         <w:pStyle w:val="Heading2"/>
       </w:pPr>
       <w:r>
+        <w:lastRenderedPageBreak/>
         <w:t>Latency and the Dropouts Lamp</w:t>
       </w:r>
     </w:p>
@@ -455,6 +665,57 @@
     <w:p>
       <w:r>
         <w:t>One caution: if your audio device uses a very large buffer, Normal leaves the apps little safety margin. If an app still drops out with a large buffer, choose High.</w:t>
+      </w:r>
+    </w:p>
+    <w:p>
+      <w:pPr>
+        <w:jc w:val="center"/>
+      </w:pPr>
+      <w:r>
+        <w:rPr>
+          <w:noProof/>
+        </w:rPr>
+        <w:drawing>
+          <wp:inline distT="0" distB="0" distL="0" distR="0" wp14:anchorId="45568F81" wp14:editId="449ABA8E">
+            <wp:extent cx="4955003" cy="1905770"/>
+            <wp:effectExtent l="0" t="0" r="0" b="0"/>
+            <wp:docPr id="50776597" name="Picture 5"/>
+            <wp:cNvGraphicFramePr>
+              <a:graphicFrameLocks xmlns:a="http://schemas.openxmlformats.org/drawingml/2006/main" noChangeAspect="1"/>
+            </wp:cNvGraphicFramePr>
+            <a:graphic xmlns:a="http://schemas.openxmlformats.org/drawingml/2006/main">
+              <a:graphicData uri="http://schemas.openxmlformats.org/drawingml/2006/picture">
+                <pic:pic xmlns:pic="http://schemas.openxmlformats.org/drawingml/2006/picture">
+                  <pic:nvPicPr>
+                    <pic:cNvPr id="50776597" name=""/>
+                    <pic:cNvPicPr/>
+                  </pic:nvPicPr>
+                  <pic:blipFill>
+                    <a:blip r:embed="rId8">
+                      <a:extLst>
+                        <a:ext uri="{28A0092B-C50C-407E-A947-70E740481C1C}">
+                          <a14:useLocalDpi xmlns:a14="http://schemas.microsoft.com/office/drawing/2010/main" val="0"/>
+                        </a:ext>
+                      </a:extLst>
+                    </a:blip>
+                    <a:stretch>
+                      <a:fillRect/>
+                    </a:stretch>
+                  </pic:blipFill>
+                  <pic:spPr>
+                    <a:xfrm>
+                      <a:off x="0" y="0"/>
+                      <a:ext cx="4955003" cy="1905770"/>
+                    </a:xfrm>
+                    <a:prstGeom prst="rect">
+                      <a:avLst/>
+                    </a:prstGeom>
+                  </pic:spPr>
+                </pic:pic>
+              </a:graphicData>
+            </a:graphic>
+          </wp:inline>
+        </w:drawing>
       </w:r>
     </w:p>
     <w:p>
@@ -462,7 +723,59 @@
         <w:rPr>
           <w:i/>
         </w:rPr>
-        <w:t>[Screenshot: Settings page, Clients section, showing the Latency choice.]</w:t>
+        <w:t>Settings page, Clients section, showing the Latency choice.</w:t>
+      </w:r>
+    </w:p>
+    <w:p>
+      <w:pPr>
+        <w:jc w:val="center"/>
+      </w:pPr>
+      <w:r>
+        <w:rPr>
+          <w:noProof/>
+        </w:rPr>
+        <w:lastRenderedPageBreak/>
+        <w:drawing>
+          <wp:inline distT="0" distB="0" distL="0" distR="0" wp14:anchorId="6B9B2CC9" wp14:editId="258F816E">
+            <wp:extent cx="1644952" cy="4318000"/>
+            <wp:effectExtent l="0" t="0" r="0" b="6350"/>
+            <wp:docPr id="481338087" name="Picture 6"/>
+            <wp:cNvGraphicFramePr>
+              <a:graphicFrameLocks xmlns:a="http://schemas.openxmlformats.org/drawingml/2006/main" noChangeAspect="1"/>
+            </wp:cNvGraphicFramePr>
+            <a:graphic xmlns:a="http://schemas.openxmlformats.org/drawingml/2006/main">
+              <a:graphicData uri="http://schemas.openxmlformats.org/drawingml/2006/picture">
+                <pic:pic xmlns:pic="http://schemas.openxmlformats.org/drawingml/2006/picture">
+                  <pic:nvPicPr>
+                    <pic:cNvPr id="481338087" name=""/>
+                    <pic:cNvPicPr/>
+                  </pic:nvPicPr>
+                  <pic:blipFill>
+                    <a:blip r:embed="rId9">
+                      <a:extLst>
+                        <a:ext uri="{28A0092B-C50C-407E-A947-70E740481C1C}">
+                          <a14:useLocalDpi xmlns:a14="http://schemas.microsoft.com/office/drawing/2010/main" val="0"/>
+                        </a:ext>
+                      </a:extLst>
+                    </a:blip>
+                    <a:stretch>
+                      <a:fillRect/>
+                    </a:stretch>
+                  </pic:blipFill>
+                  <pic:spPr>
+                    <a:xfrm>
+                      <a:off x="0" y="0"/>
+                      <a:ext cx="1644952" cy="4318000"/>
+                    </a:xfrm>
+                    <a:prstGeom prst="rect">
+                      <a:avLst/>
+                    </a:prstGeom>
+                  </pic:spPr>
+                </pic:pic>
+              </a:graphicData>
+            </a:graphic>
+          </wp:inline>
+        </w:drawing>
       </w:r>
     </w:p>
     <w:p>
@@ -470,7 +783,7 @@
         <w:rPr>
           <w:i/>
         </w:rPr>
-        <w:t>[Screenshot: Mixer strip with the Dropouts lamp lit amber.]</w:t>
+        <w:t>Mixer strips with the Dropouts lamp on the first app latched amber after a dropout.</w:t>
       </w:r>
     </w:p>
     <w:p>
@@ -836,7 +1149,7 @@
   <w:abstractNum w:abstractNumId="0" w15:restartNumberingAfterBreak="0">
     <w:nsid w:val="FFFFFF89"/>
     <w:multiLevelType w:val="singleLevel"/>
-    <w:tmpl w:val="F62446EC"/>
+    <w:tmpl w:val="9DB47BE0"/>
     <w:lvl w:ilvl="0">
       <w:start w:val="1"/>
       <w:numFmt w:val="bullet"/>
@@ -854,7 +1167,7 @@
       </w:rPr>
     </w:lvl>
   </w:abstractNum>
-  <w:num w:numId="1" w16cid:durableId="2003703578">
+  <w:num w:numId="1" w16cid:durableId="1378582007">
     <w:abstractNumId w:val="0"/>
   </w:num>
 </w:numbering>
@@ -1268,7 +1581,7 @@
     <w:link w:val="Heading1Char"/>
     <w:uiPriority w:val="9"/>
     <w:qFormat/>
-    <w:rsid w:val="00335322"/>
+    <w:rsid w:val="002C2040"/>
     <w:pPr>
       <w:keepNext/>
       <w:keepLines/>
@@ -1290,7 +1603,7 @@
     <w:uiPriority w:val="9"/>
     <w:unhideWhenUsed/>
     <w:qFormat/>
-    <w:rsid w:val="00335322"/>
+    <w:rsid w:val="002C2040"/>
     <w:pPr>
       <w:keepNext/>
       <w:keepLines/>
@@ -1313,7 +1626,7 @@
     <w:semiHidden/>
     <w:unhideWhenUsed/>
     <w:qFormat/>
-    <w:rsid w:val="00335322"/>
+    <w:rsid w:val="002C2040"/>
     <w:pPr>
       <w:keepNext/>
       <w:keepLines/>
@@ -1336,7 +1649,7 @@
     <w:semiHidden/>
     <w:unhideWhenUsed/>
     <w:qFormat/>
-    <w:rsid w:val="00335322"/>
+    <w:rsid w:val="002C2040"/>
     <w:pPr>
       <w:keepNext/>
       <w:keepLines/>
@@ -1359,7 +1672,7 @@
     <w:semiHidden/>
     <w:unhideWhenUsed/>
     <w:qFormat/>
-    <w:rsid w:val="00335322"/>
+    <w:rsid w:val="002C2040"/>
     <w:pPr>
       <w:keepNext/>
       <w:keepLines/>
@@ -1380,7 +1693,7 @@
     <w:semiHidden/>
     <w:unhideWhenUsed/>
     <w:qFormat/>
-    <w:rsid w:val="00335322"/>
+    <w:rsid w:val="002C2040"/>
     <w:pPr>
       <w:keepNext/>
       <w:keepLines/>
@@ -1403,7 +1716,7 @@
     <w:semiHidden/>
     <w:unhideWhenUsed/>
     <w:qFormat/>
-    <w:rsid w:val="00335322"/>
+    <w:rsid w:val="002C2040"/>
     <w:pPr>
       <w:keepNext/>
       <w:keepLines/>
@@ -1424,7 +1737,7 @@
     <w:semiHidden/>
     <w:unhideWhenUsed/>
     <w:qFormat/>
-    <w:rsid w:val="00335322"/>
+    <w:rsid w:val="002C2040"/>
     <w:pPr>
       <w:keepNext/>
       <w:keepLines/>
@@ -1447,7 +1760,7 @@
     <w:semiHidden/>
     <w:unhideWhenUsed/>
     <w:qFormat/>
-    <w:rsid w:val="00335322"/>
+    <w:rsid w:val="002C2040"/>
     <w:pPr>
       <w:keepNext/>
       <w:keepLines/>
@@ -1491,7 +1804,7 @@
     <w:basedOn w:val="DefaultParagraphFont"/>
     <w:link w:val="Heading1"/>
     <w:uiPriority w:val="9"/>
-    <w:rsid w:val="00335322"/>
+    <w:rsid w:val="002C2040"/>
     <w:rPr>
       <w:rFonts w:asciiTheme="majorHAnsi" w:eastAsiaTheme="majorEastAsia" w:hAnsiTheme="majorHAnsi" w:cstheme="majorBidi"/>
       <w:color w:val="0F4761" w:themeColor="accent1" w:themeShade="BF"/>
@@ -1504,7 +1817,7 @@
     <w:basedOn w:val="DefaultParagraphFont"/>
     <w:link w:val="Heading2"/>
     <w:uiPriority w:val="9"/>
-    <w:rsid w:val="00335322"/>
+    <w:rsid w:val="002C2040"/>
     <w:rPr>
       <w:rFonts w:asciiTheme="majorHAnsi" w:eastAsiaTheme="majorEastAsia" w:hAnsiTheme="majorHAnsi" w:cstheme="majorBidi"/>
       <w:color w:val="0F4761" w:themeColor="accent1" w:themeShade="BF"/>
@@ -1518,7 +1831,7 @@
     <w:link w:val="Heading3"/>
     <w:uiPriority w:val="9"/>
     <w:semiHidden/>
-    <w:rsid w:val="00335322"/>
+    <w:rsid w:val="002C2040"/>
     <w:rPr>
       <w:rFonts w:eastAsiaTheme="majorEastAsia" w:cstheme="majorBidi"/>
       <w:color w:val="0F4761" w:themeColor="accent1" w:themeShade="BF"/>
@@ -1532,7 +1845,7 @@
     <w:link w:val="Heading4"/>
     <w:uiPriority w:val="9"/>
     <w:semiHidden/>
-    <w:rsid w:val="00335322"/>
+    <w:rsid w:val="002C2040"/>
     <w:rPr>
       <w:rFonts w:eastAsiaTheme="majorEastAsia" w:cstheme="majorBidi"/>
       <w:i/>
@@ -1546,7 +1859,7 @@
     <w:link w:val="Heading5"/>
     <w:uiPriority w:val="9"/>
     <w:semiHidden/>
-    <w:rsid w:val="00335322"/>
+    <w:rsid w:val="002C2040"/>
     <w:rPr>
       <w:rFonts w:eastAsiaTheme="majorEastAsia" w:cstheme="majorBidi"/>
       <w:color w:val="0F4761" w:themeColor="accent1" w:themeShade="BF"/>
@@ -1558,7 +1871,7 @@
     <w:link w:val="Heading6"/>
     <w:uiPriority w:val="9"/>
     <w:semiHidden/>
-    <w:rsid w:val="00335322"/>
+    <w:rsid w:val="002C2040"/>
     <w:rPr>
       <w:rFonts w:eastAsiaTheme="majorEastAsia" w:cstheme="majorBidi"/>
       <w:i/>
@@ -1572,7 +1885,7 @@
     <w:link w:val="Heading7"/>
     <w:uiPriority w:val="9"/>
     <w:semiHidden/>
-    <w:rsid w:val="00335322"/>
+    <w:rsid w:val="002C2040"/>
     <w:rPr>
       <w:rFonts w:eastAsiaTheme="majorEastAsia" w:cstheme="majorBidi"/>
       <w:color w:val="595959" w:themeColor="text1" w:themeTint="A6"/>
@@ -1584,7 +1897,7 @@
     <w:link w:val="Heading8"/>
     <w:uiPriority w:val="9"/>
     <w:semiHidden/>
-    <w:rsid w:val="00335322"/>
+    <w:rsid w:val="002C2040"/>
     <w:rPr>
       <w:rFonts w:eastAsiaTheme="majorEastAsia" w:cstheme="majorBidi"/>
       <w:i/>
@@ -1598,7 +1911,7 @@
     <w:link w:val="Heading9"/>
     <w:uiPriority w:val="9"/>
     <w:semiHidden/>
-    <w:rsid w:val="00335322"/>
+    <w:rsid w:val="002C2040"/>
     <w:rPr>
       <w:rFonts w:eastAsiaTheme="majorEastAsia" w:cstheme="majorBidi"/>
       <w:color w:val="272727" w:themeColor="text1" w:themeTint="D8"/>
@@ -1611,7 +1924,7 @@
     <w:link w:val="TitleChar"/>
     <w:uiPriority w:val="10"/>
     <w:qFormat/>
-    <w:rsid w:val="00335322"/>
+    <w:rsid w:val="002C2040"/>
     <w:pPr>
       <w:spacing w:after="80" w:line="240" w:lineRule="auto"/>
       <w:contextualSpacing/>
@@ -1629,7 +1942,7 @@
     <w:basedOn w:val="DefaultParagraphFont"/>
     <w:link w:val="Title"/>
     <w:uiPriority w:val="10"/>
-    <w:rsid w:val="00335322"/>
+    <w:rsid w:val="002C2040"/>
     <w:rPr>
       <w:rFonts w:asciiTheme="majorHAnsi" w:eastAsiaTheme="majorEastAsia" w:hAnsiTheme="majorHAnsi" w:cstheme="majorBidi"/>
       <w:spacing w:val="-10"/>
@@ -1645,7 +1958,7 @@
     <w:link w:val="SubtitleChar"/>
     <w:uiPriority w:val="11"/>
     <w:qFormat/>
-    <w:rsid w:val="00335322"/>
+    <w:rsid w:val="002C2040"/>
     <w:pPr>
       <w:numPr>
         <w:ilvl w:val="1"/>
@@ -1664,7 +1977,7 @@
     <w:basedOn w:val="DefaultParagraphFont"/>
     <w:link w:val="Subtitle"/>
     <w:uiPriority w:val="11"/>
-    <w:rsid w:val="00335322"/>
+    <w:rsid w:val="002C2040"/>
     <w:rPr>
       <w:rFonts w:eastAsiaTheme="majorEastAsia" w:cstheme="majorBidi"/>
       <w:color w:val="595959" w:themeColor="text1" w:themeTint="A6"/>
@@ -1680,7 +1993,7 @@
     <w:link w:val="QuoteChar"/>
     <w:uiPriority w:val="29"/>
     <w:qFormat/>
-    <w:rsid w:val="00335322"/>
+    <w:rsid w:val="002C2040"/>
     <w:pPr>
       <w:spacing w:before="160"/>
       <w:jc w:val="center"/>
@@ -1696,7 +2009,7 @@
     <w:basedOn w:val="DefaultParagraphFont"/>
     <w:link w:val="Quote"/>
     <w:uiPriority w:val="29"/>
-    <w:rsid w:val="00335322"/>
+    <w:rsid w:val="002C2040"/>
     <w:rPr>
       <w:i/>
       <w:iCs/>
@@ -1708,7 +2021,7 @@
     <w:basedOn w:val="Normal"/>
     <w:uiPriority w:val="34"/>
     <w:qFormat/>
-    <w:rsid w:val="00335322"/>
+    <w:rsid w:val="002C2040"/>
     <w:pPr>
       <w:ind w:left="720"/>
       <w:contextualSpacing/>
@@ -1719,7 +2032,7 @@
     <w:basedOn w:val="DefaultParagraphFont"/>
     <w:uiPriority w:val="21"/>
     <w:qFormat/>
-    <w:rsid w:val="00335322"/>
+    <w:rsid w:val="002C2040"/>
     <w:rPr>
       <w:i/>
       <w:iCs/>
@@ -1733,7 +2046,7 @@
     <w:link w:val="IntenseQuoteChar"/>
     <w:uiPriority w:val="30"/>
     <w:qFormat/>
-    <w:rsid w:val="00335322"/>
+    <w:rsid w:val="002C2040"/>
     <w:pPr>
       <w:pBdr>
         <w:top w:val="single" w:sz="4" w:space="10" w:color="0F4761" w:themeColor="accent1" w:themeShade="BF"/>
@@ -1754,7 +2067,7 @@
     <w:basedOn w:val="DefaultParagraphFont"/>
     <w:link w:val="IntenseQuote"/>
     <w:uiPriority w:val="30"/>
-    <w:rsid w:val="00335322"/>
+    <w:rsid w:val="002C2040"/>
     <w:rPr>
       <w:i/>
       <w:iCs/>
@@ -1766,7 +2079,7 @@
     <w:basedOn w:val="DefaultParagraphFont"/>
     <w:uiPriority w:val="32"/>
     <w:qFormat/>
-    <w:rsid w:val="00335322"/>
+    <w:rsid w:val="002C2040"/>
     <w:rPr>
       <w:b/>
       <w:bCs/>
@@ -1780,7 +2093,7 @@
     <w:basedOn w:val="Normal"/>
     <w:uiPriority w:val="99"/>
     <w:unhideWhenUsed/>
-    <w:rsid w:val="00335322"/>
+    <w:rsid w:val="002C2040"/>
     <w:pPr>
       <w:numPr>
         <w:numId w:val="1"/>

</xml_diff>

<commit_message>
Stage G: mu-link manual describes the stereo meter; new screenshots
Refs #1594: docs Pass
Version: v1.1.0.1409

Co-Authored-By: Claude Sonnet 5.5 <noreply@anthropic.com>
</commit_message>
<xml_diff>
--- a/docs/mu-link/mu-link User Manual.docx
+++ b/docs/mu-link/mu-link User Manual.docx
@@ -74,10 +74,10 @@
           <w:noProof/>
         </w:rPr>
         <w:drawing>
-          <wp:inline distT="0" distB="0" distL="0" distR="0" wp14:anchorId="283B9146" wp14:editId="2B59297C">
+          <wp:inline distT="0" distB="0" distL="0" distR="0" wp14:anchorId="26E9BAF0" wp14:editId="211ACA26">
             <wp:extent cx="5274310" cy="4058920"/>
             <wp:effectExtent l="0" t="0" r="2540" b="0"/>
-            <wp:docPr id="2019903596" name="Picture 1"/>
+            <wp:docPr id="2012086396" name="Picture 1"/>
             <wp:cNvGraphicFramePr>
               <a:graphicFrameLocks xmlns:a="http://schemas.openxmlformats.org/drawingml/2006/main" noChangeAspect="1"/>
             </wp:cNvGraphicFramePr>
@@ -85,7 +85,7 @@
               <a:graphicData uri="http://schemas.openxmlformats.org/drawingml/2006/picture">
                 <pic:pic xmlns:pic="http://schemas.openxmlformats.org/drawingml/2006/picture">
                   <pic:nvPicPr>
-                    <pic:cNvPr id="2019903596" name=""/>
+                    <pic:cNvPr id="2012086396" name=""/>
                     <pic:cNvPicPr/>
                   </pic:nvPicPr>
                   <pic:blipFill>
@@ -218,10 +218,10 @@
         </w:rPr>
         <w:lastRenderedPageBreak/>
         <w:drawing>
-          <wp:inline distT="0" distB="0" distL="0" distR="0" wp14:anchorId="6AE913CF" wp14:editId="7738149B">
+          <wp:inline distT="0" distB="0" distL="0" distR="0" wp14:anchorId="35CB1CC8" wp14:editId="6683FD05">
             <wp:extent cx="5274310" cy="4058920"/>
             <wp:effectExtent l="0" t="0" r="2540" b="0"/>
-            <wp:docPr id="1175078515" name="Picture 2"/>
+            <wp:docPr id="602331443" name="Picture 2"/>
             <wp:cNvGraphicFramePr>
               <a:graphicFrameLocks xmlns:a="http://schemas.openxmlformats.org/drawingml/2006/main" noChangeAspect="1"/>
             </wp:cNvGraphicFramePr>
@@ -229,7 +229,7 @@
               <a:graphicData uri="http://schemas.openxmlformats.org/drawingml/2006/picture">
                 <pic:pic xmlns:pic="http://schemas.openxmlformats.org/drawingml/2006/picture">
                   <pic:nvPicPr>
-                    <pic:cNvPr id="1175078515" name=""/>
+                    <pic:cNvPr id="602331443" name=""/>
                     <pic:cNvPicPr/>
                   </pic:nvPicPr>
                   <pic:blipFill>
@@ -328,10 +328,10 @@
         </w:rPr>
         <w:lastRenderedPageBreak/>
         <w:drawing>
-          <wp:inline distT="0" distB="0" distL="0" distR="0" wp14:anchorId="31A4108B" wp14:editId="0074134A">
+          <wp:inline distT="0" distB="0" distL="0" distR="0" wp14:anchorId="564BA74C" wp14:editId="3FDC75C4">
             <wp:extent cx="5145580" cy="1905770"/>
             <wp:effectExtent l="0" t="0" r="0" b="0"/>
-            <wp:docPr id="1134791202" name="Picture 3"/>
+            <wp:docPr id="541426436" name="Picture 3"/>
             <wp:cNvGraphicFramePr>
               <a:graphicFrameLocks xmlns:a="http://schemas.openxmlformats.org/drawingml/2006/main" noChangeAspect="1"/>
             </wp:cNvGraphicFramePr>
@@ -339,7 +339,7 @@
               <a:graphicData uri="http://schemas.openxmlformats.org/drawingml/2006/picture">
                 <pic:pic xmlns:pic="http://schemas.openxmlformats.org/drawingml/2006/picture">
                   <pic:nvPicPr>
-                    <pic:cNvPr id="1134791202" name=""/>
+                    <pic:cNvPr id="541426436" name=""/>
                     <pic:cNvPicPr/>
                   </pic:nvPicPr>
                   <pic:blipFill>
@@ -387,10 +387,10 @@
           <w:noProof/>
         </w:rPr>
         <w:drawing>
-          <wp:inline distT="0" distB="0" distL="0" distR="0" wp14:anchorId="654813E2" wp14:editId="55EDF2D2">
+          <wp:inline distT="0" distB="0" distL="0" distR="0" wp14:anchorId="0A92B10E" wp14:editId="4B6AD20F">
             <wp:extent cx="3658111" cy="2905530"/>
             <wp:effectExtent l="0" t="0" r="0" b="0"/>
-            <wp:docPr id="1465937797" name="Picture 4"/>
+            <wp:docPr id="1583990199" name="Picture 4"/>
             <wp:cNvGraphicFramePr>
               <a:graphicFrameLocks xmlns:a="http://schemas.openxmlformats.org/drawingml/2006/main" noChangeAspect="1"/>
             </wp:cNvGraphicFramePr>
@@ -398,7 +398,7 @@
               <a:graphicData uri="http://schemas.openxmlformats.org/drawingml/2006/picture">
                 <pic:pic xmlns:pic="http://schemas.openxmlformats.org/drawingml/2006/picture">
                   <pic:nvPicPr>
-                    <pic:cNvPr id="1465937797" name=""/>
+                    <pic:cNvPr id="1583990199" name=""/>
                     <pic:cNvPicPr/>
                   </pic:nvPicPr>
                   <pic:blipFill>
@@ -463,7 +463,7 @@
         <w:pStyle w:val="ListBullet"/>
       </w:pPr>
       <w:r>
-        <w:t>Within about a second the app detects mu-link and attaches. The app's title bar shows 'mu-link connected', and it appears as a named strip in mu-link's meter section.</w:t>
+        <w:t>Within about a second the app detects mu-link and attaches. The app's title bar shows 'mu-link connected', and it appears as a named strip in mu-link's Clients mixer.</w:t>
       </w:r>
     </w:p>
     <w:p>
@@ -548,15 +548,23 @@
     </w:p>
     <w:p>
       <w:r>
-        <w:t>Each connected app gets a channel strip in the meter section, plus a Master strip on the right. From top to bottom a strip has a level meter, the app's name, a gain knob, and Mute (M) and Solo (S) buttons.</w:t>
-      </w:r>
-    </w:p>
-    <w:p>
-      <w:pPr>
-        <w:pStyle w:val="ListBullet"/>
-      </w:pPr>
-      <w:r>
-        <w:t>Gain — sets the app's level in the mix.</w:t>
+        <w:t>Each connected app gets a channel strip in the Clients mixer, plus a Master strip on the right. From top to bottom a strip has the app's name, an equaliser (High, Mid Hz, Mid and Low knobs), a vertical fader with a stereo meter beside it, a level readout, Mute (M) and Solo (S) buttons, and the Dropouts lamp.</w:t>
+      </w:r>
+    </w:p>
+    <w:p>
+      <w:pPr>
+        <w:pStyle w:val="ListBullet"/>
+      </w:pPr>
+      <w:r>
+        <w:t>Fader — sets the app's level in the mix.</w:t>
+      </w:r>
+    </w:p>
+    <w:p>
+      <w:pPr>
+        <w:pStyle w:val="ListBullet"/>
+      </w:pPr>
+      <w:r>
+        <w:t>Stereo meter — two bars beside the fader show the left and right levels of that app. Each bar has a clip marker that lights if the signal reaches full scale and stays lit until you click the meter to clear it.</w:t>
       </w:r>
     </w:p>
     <w:p>
@@ -580,91 +588,12 @@
         <w:pStyle w:val="ListBullet"/>
       </w:pPr>
       <w:r>
-        <w:t>Master — a gain knob and meter for the summed output.</w:t>
+        <w:t>Master — a fader and stereo meter for the summed output. Click its meter to clear the clip marker.</w:t>
       </w:r>
     </w:p>
     <w:p>
       <w:r>
         <w:t>The master output is protected by a safety limiter, so the summed mix can never harshly clip the soundcard no matter how hot the connected apps run. Normal levels pass through untouched.</w:t>
-      </w:r>
-    </w:p>
-    <w:p>
-      <w:r>
-        <w:rPr>
-          <w:i/>
-        </w:rPr>
-        <w:t>[Screenshot: Meter strip with several app channels (gain, M, S) and the Master strip.]</w:t>
-      </w:r>
-    </w:p>
-    <w:p>
-      <w:pPr>
-        <w:pStyle w:val="Heading2"/>
-      </w:pPr>
-      <w:r>
-        <w:lastRenderedPageBreak/>
-        <w:t>Latency and the Dropouts Lamp</w:t>
-      </w:r>
-    </w:p>
-    <w:p>
-      <w:r>
-        <w:t>Each connected app renders its audio a little ahead of time, so that a momentary slowdown in one app never glitches the mix. The Latency setting decides how far ahead. A shorter lead means less delay between an app and what you hear; a longer lead gives the apps more safety margin.</w:t>
-      </w:r>
-    </w:p>
-    <w:p>
-      <w:r>
-        <w:t>To change it, open Settings (the gear button) and look in the Clients section.</w:t>
-      </w:r>
-    </w:p>
-    <w:p>
-      <w:pPr>
-        <w:pStyle w:val="ListBullet"/>
-      </w:pPr>
-      <w:r>
-        <w:t>Latency — Low, Normal or High. Low is about 43 milliseconds at 48 kHz, Normal about 85 milliseconds, High about 171 milliseconds (2048, 4096 and 8192 frames). Default: Normal. The setting applies to every connected app at once, and to any app that connects later. mu-link remembers it between sessions.</w:t>
-      </w:r>
-    </w:p>
-    <w:p>
-      <w:r>
-        <w:t>Start with Normal. If you want the tightest response and your computer copes, try Low. If you hear dropouts or clicks from an app, raise Latency to High.</w:t>
-      </w:r>
-    </w:p>
-    <w:p>
-      <w:r>
-        <w:t>Each app's strip also has a Dropouts lamp. It tells you when that app could not keep up and mu-link had to fill the gap with silence.</w:t>
-      </w:r>
-    </w:p>
-    <w:p>
-      <w:pPr>
-        <w:pStyle w:val="ListBullet"/>
-      </w:pPr>
-      <w:r>
-        <w:t>Unlit — no dropouts. Hover over it and the status bar reads No dropouts.</w:t>
-      </w:r>
-    </w:p>
-    <w:p>
-      <w:pPr>
-        <w:pStyle w:val="ListBullet"/>
-      </w:pPr>
-      <w:r>
-        <w:t>Red — a dropout has just happened.</w:t>
-      </w:r>
-    </w:p>
-    <w:p>
-      <w:pPr>
-        <w:pStyle w:val="ListBullet"/>
-      </w:pPr>
-      <w:r>
-        <w:t>Amber — a dropout happened a little while ago and the lamp is holding the warning. Click the lamp to clear it.</w:t>
-      </w:r>
-    </w:p>
-    <w:p>
-      <w:r>
-        <w:t>A dropout in the first second after an app connects is normal and does not light the lamp. Changing Latency clears the lamps, because the old warnings no longer apply. Hover over a lit lamp and the status bar suggests raising Latency.</w:t>
-      </w:r>
-    </w:p>
-    <w:p>
-      <w:r>
-        <w:t>One caution: if your audio device uses a very large buffer, Normal leaves the apps little safety margin. If an app still drops out with a large buffer, choose High.</w:t>
       </w:r>
     </w:p>
     <w:p>
@@ -675,11 +604,12 @@
         <w:rPr>
           <w:noProof/>
         </w:rPr>
+        <w:lastRenderedPageBreak/>
         <w:drawing>
-          <wp:inline distT="0" distB="0" distL="0" distR="0" wp14:anchorId="45568F81" wp14:editId="449ABA8E">
-            <wp:extent cx="4955003" cy="1905770"/>
-            <wp:effectExtent l="0" t="0" r="0" b="0"/>
-            <wp:docPr id="50776597" name="Picture 5"/>
+          <wp:inline distT="0" distB="0" distL="0" distR="0" wp14:anchorId="66C61190" wp14:editId="221A5A42">
+            <wp:extent cx="5274310" cy="4058920"/>
+            <wp:effectExtent l="0" t="0" r="2540" b="0"/>
+            <wp:docPr id="1531784951" name="Picture 5"/>
             <wp:cNvGraphicFramePr>
               <a:graphicFrameLocks xmlns:a="http://schemas.openxmlformats.org/drawingml/2006/main" noChangeAspect="1"/>
             </wp:cNvGraphicFramePr>
@@ -687,7 +617,137 @@
               <a:graphicData uri="http://schemas.openxmlformats.org/drawingml/2006/picture">
                 <pic:pic xmlns:pic="http://schemas.openxmlformats.org/drawingml/2006/picture">
                   <pic:nvPicPr>
-                    <pic:cNvPr id="50776597" name=""/>
+                    <pic:cNvPr id="1531784951" name=""/>
+                    <pic:cNvPicPr/>
+                  </pic:nvPicPr>
+                  <pic:blipFill>
+                    <a:blip r:embed="rId5">
+                      <a:extLst>
+                        <a:ext uri="{28A0092B-C50C-407E-A947-70E740481C1C}">
+                          <a14:useLocalDpi xmlns:a14="http://schemas.microsoft.com/office/drawing/2010/main" val="0"/>
+                        </a:ext>
+                      </a:extLst>
+                    </a:blip>
+                    <a:stretch>
+                      <a:fillRect/>
+                    </a:stretch>
+                  </pic:blipFill>
+                  <pic:spPr>
+                    <a:xfrm>
+                      <a:off x="0" y="0"/>
+                      <a:ext cx="5274310" cy="4058920"/>
+                    </a:xfrm>
+                    <a:prstGeom prst="rect">
+                      <a:avLst/>
+                    </a:prstGeom>
+                  </pic:spPr>
+                </pic:pic>
+              </a:graphicData>
+            </a:graphic>
+          </wp:inline>
+        </w:drawing>
+      </w:r>
+    </w:p>
+    <w:p>
+      <w:r>
+        <w:rPr>
+          <w:i/>
+        </w:rPr>
+        <w:t>Mixer strips with faders, stereo meters, M, S and the Master strip.</w:t>
+      </w:r>
+    </w:p>
+    <w:p>
+      <w:pPr>
+        <w:pStyle w:val="Heading2"/>
+      </w:pPr>
+      <w:r>
+        <w:t>Latency and the Dropouts Lamp</w:t>
+      </w:r>
+    </w:p>
+    <w:p>
+      <w:r>
+        <w:t>Each connected app renders its audio a little ahead of time, so that a momentary slowdown in one app never glitches the mix. The Latency setting decides how far ahead. A shorter lead means less delay between an app and what you hear; a longer lead gives the apps more safety margin.</w:t>
+      </w:r>
+    </w:p>
+    <w:p>
+      <w:r>
+        <w:t>To change it, open Settings (the gear button) and look in the Clients section.</w:t>
+      </w:r>
+    </w:p>
+    <w:p>
+      <w:pPr>
+        <w:pStyle w:val="ListBullet"/>
+      </w:pPr>
+      <w:r>
+        <w:t>Latency — Low, Normal or High. Low is about 43 milliseconds at 48 kHz, Normal about 85 milliseconds, High about 171 milliseconds (2048, 4096 and 8192 frames). Default: Normal. The setting applies to every connected app at once, and to any app that connects later. mu-link remembers it between sessions.</w:t>
+      </w:r>
+    </w:p>
+    <w:p>
+      <w:r>
+        <w:t>Start with Normal. If you want the tightest response and your computer copes, try Low. If you hear dropouts or clicks from an app, raise Latency to High.</w:t>
+      </w:r>
+    </w:p>
+    <w:p>
+      <w:r>
+        <w:t>Each app's strip also has a Dropouts lamp. It tells you when that app could not keep up and mu-link had to fill the gap with silence.</w:t>
+      </w:r>
+    </w:p>
+    <w:p>
+      <w:pPr>
+        <w:pStyle w:val="ListBullet"/>
+      </w:pPr>
+      <w:r>
+        <w:t>Unlit — no dropouts. Hover over it and the status bar reads No dropouts.</w:t>
+      </w:r>
+    </w:p>
+    <w:p>
+      <w:pPr>
+        <w:pStyle w:val="ListBullet"/>
+      </w:pPr>
+      <w:r>
+        <w:t>Red — a dropout has just happened.</w:t>
+      </w:r>
+    </w:p>
+    <w:p>
+      <w:pPr>
+        <w:pStyle w:val="ListBullet"/>
+      </w:pPr>
+      <w:r>
+        <w:t>Amber — a dropout happened a little while ago and the lamp is holding the warning. Click the lamp to clear it.</w:t>
+      </w:r>
+    </w:p>
+    <w:p>
+      <w:r>
+        <w:lastRenderedPageBreak/>
+        <w:t>A dropout in the first second after an app connects is normal and does not light the lamp. Changing Latency clears the lamps, because the old warnings no longer apply. Hover over a lit lamp and the status bar suggests raising Latency.</w:t>
+      </w:r>
+    </w:p>
+    <w:p>
+      <w:r>
+        <w:t>One caution: if your audio device uses a very large buffer, Normal leaves the apps little safety margin. If an app still drops out with a large buffer, choose High.</w:t>
+      </w:r>
+    </w:p>
+    <w:p>
+      <w:pPr>
+        <w:jc w:val="center"/>
+      </w:pPr>
+      <w:r>
+        <w:rPr>
+          <w:noProof/>
+        </w:rPr>
+        <w:drawing>
+          <wp:inline distT="0" distB="0" distL="0" distR="0" wp14:anchorId="507DDF1C" wp14:editId="78D41F64">
+            <wp:extent cx="4955003" cy="1905770"/>
+            <wp:effectExtent l="0" t="0" r="0" b="0"/>
+            <wp:docPr id="818011462" name="Picture 6"/>
+            <wp:cNvGraphicFramePr>
+              <a:graphicFrameLocks xmlns:a="http://schemas.openxmlformats.org/drawingml/2006/main" noChangeAspect="1"/>
+            </wp:cNvGraphicFramePr>
+            <a:graphic xmlns:a="http://schemas.openxmlformats.org/drawingml/2006/main">
+              <a:graphicData uri="http://schemas.openxmlformats.org/drawingml/2006/picture">
+                <pic:pic xmlns:pic="http://schemas.openxmlformats.org/drawingml/2006/picture">
+                  <pic:nvPicPr>
+                    <pic:cNvPr id="818011462" name=""/>
                     <pic:cNvPicPr/>
                   </pic:nvPicPr>
                   <pic:blipFill>
@@ -734,12 +794,11 @@
         <w:rPr>
           <w:noProof/>
         </w:rPr>
-        <w:lastRenderedPageBreak/>
         <w:drawing>
-          <wp:inline distT="0" distB="0" distL="0" distR="0" wp14:anchorId="6B9B2CC9" wp14:editId="258F816E">
+          <wp:inline distT="0" distB="0" distL="0" distR="0" wp14:anchorId="17291462" wp14:editId="06961969">
             <wp:extent cx="1644952" cy="4318000"/>
             <wp:effectExtent l="0" t="0" r="0" b="6350"/>
-            <wp:docPr id="481338087" name="Picture 6"/>
+            <wp:docPr id="1013854741" name="Picture 7"/>
             <wp:cNvGraphicFramePr>
               <a:graphicFrameLocks xmlns:a="http://schemas.openxmlformats.org/drawingml/2006/main" noChangeAspect="1"/>
             </wp:cNvGraphicFramePr>
@@ -747,7 +806,7 @@
               <a:graphicData uri="http://schemas.openxmlformats.org/drawingml/2006/picture">
                 <pic:pic xmlns:pic="http://schemas.openxmlformats.org/drawingml/2006/picture">
                   <pic:nvPicPr>
-                    <pic:cNvPr id="481338087" name=""/>
+                    <pic:cNvPr id="1013854741" name=""/>
                     <pic:cNvPicPr/>
                   </pic:nvPicPr>
                   <pic:blipFill>
@@ -1102,7 +1161,7 @@
         <w:pStyle w:val="ListBullet"/>
       </w:pPr>
       <w:r>
-        <w:t>Mixer: per-app gain, mute, solo; master gain with a safety limiter; live metering per app and on the master.</w:t>
+        <w:t>Mixer: per-app fader, mute, solo; master gain with a safety limiter; live stereo metering per app and on the master.</w:t>
       </w:r>
     </w:p>
     <w:p>
@@ -1149,7 +1208,7 @@
   <w:abstractNum w:abstractNumId="0" w15:restartNumberingAfterBreak="0">
     <w:nsid w:val="FFFFFF89"/>
     <w:multiLevelType w:val="singleLevel"/>
-    <w:tmpl w:val="9DB47BE0"/>
+    <w:tmpl w:val="4B78CF52"/>
     <w:lvl w:ilvl="0">
       <w:start w:val="1"/>
       <w:numFmt w:val="bullet"/>
@@ -1167,7 +1226,7 @@
       </w:rPr>
     </w:lvl>
   </w:abstractNum>
-  <w:num w:numId="1" w16cid:durableId="1378582007">
+  <w:num w:numId="1" w16cid:durableId="1195460933">
     <w:abstractNumId w:val="0"/>
   </w:num>
 </w:numbering>
@@ -1581,7 +1640,7 @@
     <w:link w:val="Heading1Char"/>
     <w:uiPriority w:val="9"/>
     <w:qFormat/>
-    <w:rsid w:val="002C2040"/>
+    <w:rsid w:val="00F637ED"/>
     <w:pPr>
       <w:keepNext/>
       <w:keepLines/>
@@ -1603,7 +1662,7 @@
     <w:uiPriority w:val="9"/>
     <w:unhideWhenUsed/>
     <w:qFormat/>
-    <w:rsid w:val="002C2040"/>
+    <w:rsid w:val="00F637ED"/>
     <w:pPr>
       <w:keepNext/>
       <w:keepLines/>
@@ -1626,7 +1685,7 @@
     <w:semiHidden/>
     <w:unhideWhenUsed/>
     <w:qFormat/>
-    <w:rsid w:val="002C2040"/>
+    <w:rsid w:val="00F637ED"/>
     <w:pPr>
       <w:keepNext/>
       <w:keepLines/>
@@ -1649,7 +1708,7 @@
     <w:semiHidden/>
     <w:unhideWhenUsed/>
     <w:qFormat/>
-    <w:rsid w:val="002C2040"/>
+    <w:rsid w:val="00F637ED"/>
     <w:pPr>
       <w:keepNext/>
       <w:keepLines/>
@@ -1672,7 +1731,7 @@
     <w:semiHidden/>
     <w:unhideWhenUsed/>
     <w:qFormat/>
-    <w:rsid w:val="002C2040"/>
+    <w:rsid w:val="00F637ED"/>
     <w:pPr>
       <w:keepNext/>
       <w:keepLines/>
@@ -1693,7 +1752,7 @@
     <w:semiHidden/>
     <w:unhideWhenUsed/>
     <w:qFormat/>
-    <w:rsid w:val="002C2040"/>
+    <w:rsid w:val="00F637ED"/>
     <w:pPr>
       <w:keepNext/>
       <w:keepLines/>
@@ -1716,7 +1775,7 @@
     <w:semiHidden/>
     <w:unhideWhenUsed/>
     <w:qFormat/>
-    <w:rsid w:val="002C2040"/>
+    <w:rsid w:val="00F637ED"/>
     <w:pPr>
       <w:keepNext/>
       <w:keepLines/>
@@ -1737,7 +1796,7 @@
     <w:semiHidden/>
     <w:unhideWhenUsed/>
     <w:qFormat/>
-    <w:rsid w:val="002C2040"/>
+    <w:rsid w:val="00F637ED"/>
     <w:pPr>
       <w:keepNext/>
       <w:keepLines/>
@@ -1760,7 +1819,7 @@
     <w:semiHidden/>
     <w:unhideWhenUsed/>
     <w:qFormat/>
-    <w:rsid w:val="002C2040"/>
+    <w:rsid w:val="00F637ED"/>
     <w:pPr>
       <w:keepNext/>
       <w:keepLines/>
@@ -1804,7 +1863,7 @@
     <w:basedOn w:val="DefaultParagraphFont"/>
     <w:link w:val="Heading1"/>
     <w:uiPriority w:val="9"/>
-    <w:rsid w:val="002C2040"/>
+    <w:rsid w:val="00F637ED"/>
     <w:rPr>
       <w:rFonts w:asciiTheme="majorHAnsi" w:eastAsiaTheme="majorEastAsia" w:hAnsiTheme="majorHAnsi" w:cstheme="majorBidi"/>
       <w:color w:val="0F4761" w:themeColor="accent1" w:themeShade="BF"/>
@@ -1817,7 +1876,7 @@
     <w:basedOn w:val="DefaultParagraphFont"/>
     <w:link w:val="Heading2"/>
     <w:uiPriority w:val="9"/>
-    <w:rsid w:val="002C2040"/>
+    <w:rsid w:val="00F637ED"/>
     <w:rPr>
       <w:rFonts w:asciiTheme="majorHAnsi" w:eastAsiaTheme="majorEastAsia" w:hAnsiTheme="majorHAnsi" w:cstheme="majorBidi"/>
       <w:color w:val="0F4761" w:themeColor="accent1" w:themeShade="BF"/>
@@ -1831,7 +1890,7 @@
     <w:link w:val="Heading3"/>
     <w:uiPriority w:val="9"/>
     <w:semiHidden/>
-    <w:rsid w:val="002C2040"/>
+    <w:rsid w:val="00F637ED"/>
     <w:rPr>
       <w:rFonts w:eastAsiaTheme="majorEastAsia" w:cstheme="majorBidi"/>
       <w:color w:val="0F4761" w:themeColor="accent1" w:themeShade="BF"/>
@@ -1845,7 +1904,7 @@
     <w:link w:val="Heading4"/>
     <w:uiPriority w:val="9"/>
     <w:semiHidden/>
-    <w:rsid w:val="002C2040"/>
+    <w:rsid w:val="00F637ED"/>
     <w:rPr>
       <w:rFonts w:eastAsiaTheme="majorEastAsia" w:cstheme="majorBidi"/>
       <w:i/>
@@ -1859,7 +1918,7 @@
     <w:link w:val="Heading5"/>
     <w:uiPriority w:val="9"/>
     <w:semiHidden/>
-    <w:rsid w:val="002C2040"/>
+    <w:rsid w:val="00F637ED"/>
     <w:rPr>
       <w:rFonts w:eastAsiaTheme="majorEastAsia" w:cstheme="majorBidi"/>
       <w:color w:val="0F4761" w:themeColor="accent1" w:themeShade="BF"/>
@@ -1871,7 +1930,7 @@
     <w:link w:val="Heading6"/>
     <w:uiPriority w:val="9"/>
     <w:semiHidden/>
-    <w:rsid w:val="002C2040"/>
+    <w:rsid w:val="00F637ED"/>
     <w:rPr>
       <w:rFonts w:eastAsiaTheme="majorEastAsia" w:cstheme="majorBidi"/>
       <w:i/>
@@ -1885,7 +1944,7 @@
     <w:link w:val="Heading7"/>
     <w:uiPriority w:val="9"/>
     <w:semiHidden/>
-    <w:rsid w:val="002C2040"/>
+    <w:rsid w:val="00F637ED"/>
     <w:rPr>
       <w:rFonts w:eastAsiaTheme="majorEastAsia" w:cstheme="majorBidi"/>
       <w:color w:val="595959" w:themeColor="text1" w:themeTint="A6"/>
@@ -1897,7 +1956,7 @@
     <w:link w:val="Heading8"/>
     <w:uiPriority w:val="9"/>
     <w:semiHidden/>
-    <w:rsid w:val="002C2040"/>
+    <w:rsid w:val="00F637ED"/>
     <w:rPr>
       <w:rFonts w:eastAsiaTheme="majorEastAsia" w:cstheme="majorBidi"/>
       <w:i/>
@@ -1911,7 +1970,7 @@
     <w:link w:val="Heading9"/>
     <w:uiPriority w:val="9"/>
     <w:semiHidden/>
-    <w:rsid w:val="002C2040"/>
+    <w:rsid w:val="00F637ED"/>
     <w:rPr>
       <w:rFonts w:eastAsiaTheme="majorEastAsia" w:cstheme="majorBidi"/>
       <w:color w:val="272727" w:themeColor="text1" w:themeTint="D8"/>
@@ -1924,7 +1983,7 @@
     <w:link w:val="TitleChar"/>
     <w:uiPriority w:val="10"/>
     <w:qFormat/>
-    <w:rsid w:val="002C2040"/>
+    <w:rsid w:val="00F637ED"/>
     <w:pPr>
       <w:spacing w:after="80" w:line="240" w:lineRule="auto"/>
       <w:contextualSpacing/>
@@ -1942,7 +2001,7 @@
     <w:basedOn w:val="DefaultParagraphFont"/>
     <w:link w:val="Title"/>
     <w:uiPriority w:val="10"/>
-    <w:rsid w:val="002C2040"/>
+    <w:rsid w:val="00F637ED"/>
     <w:rPr>
       <w:rFonts w:asciiTheme="majorHAnsi" w:eastAsiaTheme="majorEastAsia" w:hAnsiTheme="majorHAnsi" w:cstheme="majorBidi"/>
       <w:spacing w:val="-10"/>
@@ -1958,7 +2017,7 @@
     <w:link w:val="SubtitleChar"/>
     <w:uiPriority w:val="11"/>
     <w:qFormat/>
-    <w:rsid w:val="002C2040"/>
+    <w:rsid w:val="00F637ED"/>
     <w:pPr>
       <w:numPr>
         <w:ilvl w:val="1"/>
@@ -1977,7 +2036,7 @@
     <w:basedOn w:val="DefaultParagraphFont"/>
     <w:link w:val="Subtitle"/>
     <w:uiPriority w:val="11"/>
-    <w:rsid w:val="002C2040"/>
+    <w:rsid w:val="00F637ED"/>
     <w:rPr>
       <w:rFonts w:eastAsiaTheme="majorEastAsia" w:cstheme="majorBidi"/>
       <w:color w:val="595959" w:themeColor="text1" w:themeTint="A6"/>
@@ -1993,7 +2052,7 @@
     <w:link w:val="QuoteChar"/>
     <w:uiPriority w:val="29"/>
     <w:qFormat/>
-    <w:rsid w:val="002C2040"/>
+    <w:rsid w:val="00F637ED"/>
     <w:pPr>
       <w:spacing w:before="160"/>
       <w:jc w:val="center"/>
@@ -2009,7 +2068,7 @@
     <w:basedOn w:val="DefaultParagraphFont"/>
     <w:link w:val="Quote"/>
     <w:uiPriority w:val="29"/>
-    <w:rsid w:val="002C2040"/>
+    <w:rsid w:val="00F637ED"/>
     <w:rPr>
       <w:i/>
       <w:iCs/>
@@ -2021,7 +2080,7 @@
     <w:basedOn w:val="Normal"/>
     <w:uiPriority w:val="34"/>
     <w:qFormat/>
-    <w:rsid w:val="002C2040"/>
+    <w:rsid w:val="00F637ED"/>
     <w:pPr>
       <w:ind w:left="720"/>
       <w:contextualSpacing/>
@@ -2032,7 +2091,7 @@
     <w:basedOn w:val="DefaultParagraphFont"/>
     <w:uiPriority w:val="21"/>
     <w:qFormat/>
-    <w:rsid w:val="002C2040"/>
+    <w:rsid w:val="00F637ED"/>
     <w:rPr>
       <w:i/>
       <w:iCs/>
@@ -2046,7 +2105,7 @@
     <w:link w:val="IntenseQuoteChar"/>
     <w:uiPriority w:val="30"/>
     <w:qFormat/>
-    <w:rsid w:val="002C2040"/>
+    <w:rsid w:val="00F637ED"/>
     <w:pPr>
       <w:pBdr>
         <w:top w:val="single" w:sz="4" w:space="10" w:color="0F4761" w:themeColor="accent1" w:themeShade="BF"/>
@@ -2067,7 +2126,7 @@
     <w:basedOn w:val="DefaultParagraphFont"/>
     <w:link w:val="IntenseQuote"/>
     <w:uiPriority w:val="30"/>
-    <w:rsid w:val="002C2040"/>
+    <w:rsid w:val="00F637ED"/>
     <w:rPr>
       <w:i/>
       <w:iCs/>
@@ -2079,7 +2138,7 @@
     <w:basedOn w:val="DefaultParagraphFont"/>
     <w:uiPriority w:val="32"/>
     <w:qFormat/>
-    <w:rsid w:val="002C2040"/>
+    <w:rsid w:val="00F637ED"/>
     <w:rPr>
       <w:b/>
       <w:bCs/>
@@ -2093,7 +2152,7 @@
     <w:basedOn w:val="Normal"/>
     <w:uiPriority w:val="99"/>
     <w:unhideWhenUsed/>
-    <w:rsid w:val="002C2040"/>
+    <w:rsid w:val="00F637ED"/>
     <w:pPr>
       <w:numPr>
         <w:numId w:val="1"/>

</xml_diff>

<commit_message>
Stage G: mu-link manual Ch6 shows two real apps connected
Captured mu-Clid and mu-Tant Standalones attached to mu-link with live stereo
meters; the .docx is regenerated.

Refs #1589: only the Ch9 Clock lamp capture is outstanding (needs a MIDI clock source)
Version: v1.1.0.1409

Co-Authored-By: Claude Sonnet 5.5 <noreply@anthropic.com>
</commit_message>
<xml_diff>
--- a/docs/mu-link/mu-link User Manual.docx
+++ b/docs/mu-link/mu-link User Manual.docx
@@ -74,10 +74,10 @@
           <w:noProof/>
         </w:rPr>
         <w:drawing>
-          <wp:inline distT="0" distB="0" distL="0" distR="0" wp14:anchorId="26E9BAF0" wp14:editId="211ACA26">
+          <wp:inline distT="0" distB="0" distL="0" distR="0" wp14:anchorId="62C10ED7" wp14:editId="39F859DF">
             <wp:extent cx="5274310" cy="4058920"/>
             <wp:effectExtent l="0" t="0" r="2540" b="0"/>
-            <wp:docPr id="2012086396" name="Picture 1"/>
+            <wp:docPr id="1105906089" name="Picture 1"/>
             <wp:cNvGraphicFramePr>
               <a:graphicFrameLocks xmlns:a="http://schemas.openxmlformats.org/drawingml/2006/main" noChangeAspect="1"/>
             </wp:cNvGraphicFramePr>
@@ -85,7 +85,7 @@
               <a:graphicData uri="http://schemas.openxmlformats.org/drawingml/2006/picture">
                 <pic:pic xmlns:pic="http://schemas.openxmlformats.org/drawingml/2006/picture">
                   <pic:nvPicPr>
-                    <pic:cNvPr id="2012086396" name=""/>
+                    <pic:cNvPr id="1105906089" name=""/>
                     <pic:cNvPicPr/>
                   </pic:nvPicPr>
                   <pic:blipFill>
@@ -218,10 +218,10 @@
         </w:rPr>
         <w:lastRenderedPageBreak/>
         <w:drawing>
-          <wp:inline distT="0" distB="0" distL="0" distR="0" wp14:anchorId="35CB1CC8" wp14:editId="6683FD05">
+          <wp:inline distT="0" distB="0" distL="0" distR="0" wp14:anchorId="2F38D9E6" wp14:editId="0B0840E8">
             <wp:extent cx="5274310" cy="4058920"/>
             <wp:effectExtent l="0" t="0" r="2540" b="0"/>
-            <wp:docPr id="602331443" name="Picture 2"/>
+            <wp:docPr id="569351501" name="Picture 2"/>
             <wp:cNvGraphicFramePr>
               <a:graphicFrameLocks xmlns:a="http://schemas.openxmlformats.org/drawingml/2006/main" noChangeAspect="1"/>
             </wp:cNvGraphicFramePr>
@@ -229,7 +229,7 @@
               <a:graphicData uri="http://schemas.openxmlformats.org/drawingml/2006/picture">
                 <pic:pic xmlns:pic="http://schemas.openxmlformats.org/drawingml/2006/picture">
                   <pic:nvPicPr>
-                    <pic:cNvPr id="602331443" name=""/>
+                    <pic:cNvPr id="569351501" name=""/>
                     <pic:cNvPicPr/>
                   </pic:nvPicPr>
                   <pic:blipFill>
@@ -328,10 +328,10 @@
         </w:rPr>
         <w:lastRenderedPageBreak/>
         <w:drawing>
-          <wp:inline distT="0" distB="0" distL="0" distR="0" wp14:anchorId="564BA74C" wp14:editId="3FDC75C4">
+          <wp:inline distT="0" distB="0" distL="0" distR="0" wp14:anchorId="43B8F037" wp14:editId="576DA2ED">
             <wp:extent cx="5145580" cy="1905770"/>
             <wp:effectExtent l="0" t="0" r="0" b="0"/>
-            <wp:docPr id="541426436" name="Picture 3"/>
+            <wp:docPr id="1573327006" name="Picture 3"/>
             <wp:cNvGraphicFramePr>
               <a:graphicFrameLocks xmlns:a="http://schemas.openxmlformats.org/drawingml/2006/main" noChangeAspect="1"/>
             </wp:cNvGraphicFramePr>
@@ -339,7 +339,7 @@
               <a:graphicData uri="http://schemas.openxmlformats.org/drawingml/2006/picture">
                 <pic:pic xmlns:pic="http://schemas.openxmlformats.org/drawingml/2006/picture">
                   <pic:nvPicPr>
-                    <pic:cNvPr id="541426436" name=""/>
+                    <pic:cNvPr id="1573327006" name=""/>
                     <pic:cNvPicPr/>
                   </pic:nvPicPr>
                   <pic:blipFill>
@@ -387,10 +387,10 @@
           <w:noProof/>
         </w:rPr>
         <w:drawing>
-          <wp:inline distT="0" distB="0" distL="0" distR="0" wp14:anchorId="0A92B10E" wp14:editId="4B6AD20F">
+          <wp:inline distT="0" distB="0" distL="0" distR="0" wp14:anchorId="334C3CC3" wp14:editId="0A7C33CF">
             <wp:extent cx="3658111" cy="2905530"/>
             <wp:effectExtent l="0" t="0" r="0" b="0"/>
-            <wp:docPr id="1583990199" name="Picture 4"/>
+            <wp:docPr id="1480124736" name="Picture 4"/>
             <wp:cNvGraphicFramePr>
               <a:graphicFrameLocks xmlns:a="http://schemas.openxmlformats.org/drawingml/2006/main" noChangeAspect="1"/>
             </wp:cNvGraphicFramePr>
@@ -398,7 +398,7 @@
               <a:graphicData uri="http://schemas.openxmlformats.org/drawingml/2006/picture">
                 <pic:pic xmlns:pic="http://schemas.openxmlformats.org/drawingml/2006/picture">
                   <pic:nvPicPr>
-                    <pic:cNvPr id="1583990199" name=""/>
+                    <pic:cNvPr id="1480124736" name=""/>
                     <pic:cNvPicPr/>
                   </pic:nvPicPr>
                   <pic:blipFill>
@@ -531,72 +531,6 @@
       </w:r>
     </w:p>
     <w:p>
-      <w:r>
-        <w:rPr>
-          <w:i/>
-        </w:rPr>
-        <w:t>[Screenshot: Two connected apps (mu-Clid and mu-Tant) shown as named strips with live meters.]</w:t>
-      </w:r>
-    </w:p>
-    <w:p>
-      <w:pPr>
-        <w:pStyle w:val="Heading1"/>
-      </w:pPr>
-      <w:r>
-        <w:t>7. The Mixer</w:t>
-      </w:r>
-    </w:p>
-    <w:p>
-      <w:r>
-        <w:t>Each connected app gets a channel strip in the Clients mixer, plus a Master strip on the right. From top to bottom a strip has the app's name, an equaliser (High, Mid Hz, Mid and Low knobs), a vertical fader with a stereo meter beside it, a level readout, Mute (M) and Solo (S) buttons, and the Dropouts lamp.</w:t>
-      </w:r>
-    </w:p>
-    <w:p>
-      <w:pPr>
-        <w:pStyle w:val="ListBullet"/>
-      </w:pPr>
-      <w:r>
-        <w:t>Fader — sets the app's level in the mix.</w:t>
-      </w:r>
-    </w:p>
-    <w:p>
-      <w:pPr>
-        <w:pStyle w:val="ListBullet"/>
-      </w:pPr>
-      <w:r>
-        <w:t>Stereo meter — two bars beside the fader show the left and right levels of that app. Each bar has a clip marker that lights if the signal reaches full scale and stays lit until you click the meter to clear it.</w:t>
-      </w:r>
-    </w:p>
-    <w:p>
-      <w:pPr>
-        <w:pStyle w:val="ListBullet"/>
-      </w:pPr>
-      <w:r>
-        <w:t>Mute (M) — silences that app in the mix.</w:t>
-      </w:r>
-    </w:p>
-    <w:p>
-      <w:pPr>
-        <w:pStyle w:val="ListBullet"/>
-      </w:pPr>
-      <w:r>
-        <w:t>Solo (S) — hears only the soloed app(s); everything else is muted while any Solo is active.</w:t>
-      </w:r>
-    </w:p>
-    <w:p>
-      <w:pPr>
-        <w:pStyle w:val="ListBullet"/>
-      </w:pPr>
-      <w:r>
-        <w:t>Master — a fader and stereo meter for the summed output. Click its meter to clear the clip marker.</w:t>
-      </w:r>
-    </w:p>
-    <w:p>
-      <w:r>
-        <w:t>The master output is protected by a safety limiter, so the summed mix can never harshly clip the soundcard no matter how hot the connected apps run. Normal levels pass through untouched.</w:t>
-      </w:r>
-    </w:p>
-    <w:p>
       <w:pPr>
         <w:jc w:val="center"/>
       </w:pPr>
@@ -604,12 +538,11 @@
         <w:rPr>
           <w:noProof/>
         </w:rPr>
-        <w:lastRenderedPageBreak/>
         <w:drawing>
-          <wp:inline distT="0" distB="0" distL="0" distR="0" wp14:anchorId="66C61190" wp14:editId="221A5A42">
+          <wp:inline distT="0" distB="0" distL="0" distR="0" wp14:anchorId="2D0E4D86" wp14:editId="1C09499B">
             <wp:extent cx="5274310" cy="4058920"/>
             <wp:effectExtent l="0" t="0" r="2540" b="0"/>
-            <wp:docPr id="1531784951" name="Picture 5"/>
+            <wp:docPr id="1142329574" name="Picture 5"/>
             <wp:cNvGraphicFramePr>
               <a:graphicFrameLocks xmlns:a="http://schemas.openxmlformats.org/drawingml/2006/main" noChangeAspect="1"/>
             </wp:cNvGraphicFramePr>
@@ -617,7 +550,125 @@
               <a:graphicData uri="http://schemas.openxmlformats.org/drawingml/2006/picture">
                 <pic:pic xmlns:pic="http://schemas.openxmlformats.org/drawingml/2006/picture">
                   <pic:nvPicPr>
-                    <pic:cNvPr id="1531784951" name=""/>
+                    <pic:cNvPr id="1142329574" name=""/>
+                    <pic:cNvPicPr/>
+                  </pic:nvPicPr>
+                  <pic:blipFill>
+                    <a:blip r:embed="rId8">
+                      <a:extLst>
+                        <a:ext uri="{28A0092B-C50C-407E-A947-70E740481C1C}">
+                          <a14:useLocalDpi xmlns:a14="http://schemas.microsoft.com/office/drawing/2010/main" val="0"/>
+                        </a:ext>
+                      </a:extLst>
+                    </a:blip>
+                    <a:stretch>
+                      <a:fillRect/>
+                    </a:stretch>
+                  </pic:blipFill>
+                  <pic:spPr>
+                    <a:xfrm>
+                      <a:off x="0" y="0"/>
+                      <a:ext cx="5274310" cy="4058920"/>
+                    </a:xfrm>
+                    <a:prstGeom prst="rect">
+                      <a:avLst/>
+                    </a:prstGeom>
+                  </pic:spPr>
+                </pic:pic>
+              </a:graphicData>
+            </a:graphic>
+          </wp:inline>
+        </w:drawing>
+      </w:r>
+    </w:p>
+    <w:p>
+      <w:r>
+        <w:rPr>
+          <w:i/>
+        </w:rPr>
+        <w:lastRenderedPageBreak/>
+        <w:t>Two connected apps (mu-Clid and mu-Tant) shown as named strips with live meters.</w:t>
+      </w:r>
+    </w:p>
+    <w:p>
+      <w:pPr>
+        <w:pStyle w:val="Heading1"/>
+      </w:pPr>
+      <w:r>
+        <w:t>7. The Mixer</w:t>
+      </w:r>
+    </w:p>
+    <w:p>
+      <w:r>
+        <w:t>Each connected app gets a channel strip in the Clients mixer, plus a Master strip on the right. From top to bottom a strip has the app's name, an equaliser (High, Mid Hz, Mid and Low knobs), a vertical fader with a stereo meter beside it, a level readout, Mute (M) and Solo (S) buttons, and the Dropouts lamp.</w:t>
+      </w:r>
+    </w:p>
+    <w:p>
+      <w:pPr>
+        <w:pStyle w:val="ListBullet"/>
+      </w:pPr>
+      <w:r>
+        <w:t>Fader — sets the app's level in the mix.</w:t>
+      </w:r>
+    </w:p>
+    <w:p>
+      <w:pPr>
+        <w:pStyle w:val="ListBullet"/>
+      </w:pPr>
+      <w:r>
+        <w:t>Stereo meter — two bars beside the fader show the left and right levels of that app. Each bar has a clip marker that lights if the signal reaches full scale and stays lit until you click the meter to clear it.</w:t>
+      </w:r>
+    </w:p>
+    <w:p>
+      <w:pPr>
+        <w:pStyle w:val="ListBullet"/>
+      </w:pPr>
+      <w:r>
+        <w:t>Mute (M) — silences that app in the mix.</w:t>
+      </w:r>
+    </w:p>
+    <w:p>
+      <w:pPr>
+        <w:pStyle w:val="ListBullet"/>
+      </w:pPr>
+      <w:r>
+        <w:t>Solo (S) — hears only the soloed app(s); everything else is muted while any Solo is active.</w:t>
+      </w:r>
+    </w:p>
+    <w:p>
+      <w:pPr>
+        <w:pStyle w:val="ListBullet"/>
+      </w:pPr>
+      <w:r>
+        <w:t>Master — a fader and stereo meter for the summed output. Click its meter to clear the clip marker.</w:t>
+      </w:r>
+    </w:p>
+    <w:p>
+      <w:r>
+        <w:t>The master output is protected by a safety limiter, so the summed mix can never harshly clip the soundcard no matter how hot the connected apps run. Normal levels pass through untouched.</w:t>
+      </w:r>
+    </w:p>
+    <w:p>
+      <w:pPr>
+        <w:jc w:val="center"/>
+      </w:pPr>
+      <w:r>
+        <w:rPr>
+          <w:noProof/>
+        </w:rPr>
+        <w:drawing>
+          <wp:inline distT="0" distB="0" distL="0" distR="0" wp14:anchorId="772A642B" wp14:editId="635A40A8">
+            <wp:extent cx="5274310" cy="4058920"/>
+            <wp:effectExtent l="0" t="0" r="2540" b="0"/>
+            <wp:docPr id="1145916023" name="Picture 6"/>
+            <wp:cNvGraphicFramePr>
+              <a:graphicFrameLocks xmlns:a="http://schemas.openxmlformats.org/drawingml/2006/main" noChangeAspect="1"/>
+            </wp:cNvGraphicFramePr>
+            <a:graphic xmlns:a="http://schemas.openxmlformats.org/drawingml/2006/main">
+              <a:graphicData uri="http://schemas.openxmlformats.org/drawingml/2006/picture">
+                <pic:pic xmlns:pic="http://schemas.openxmlformats.org/drawingml/2006/picture">
+                  <pic:nvPicPr>
+                    <pic:cNvPr id="1145916023" name=""/>
                     <pic:cNvPicPr/>
                   </pic:nvPicPr>
                   <pic:blipFill>
@@ -661,6 +712,7 @@
         <w:pStyle w:val="Heading2"/>
       </w:pPr>
       <w:r>
+        <w:lastRenderedPageBreak/>
         <w:t>Latency and the Dropouts Lamp</w:t>
       </w:r>
     </w:p>
@@ -718,7 +770,6 @@
     </w:p>
     <w:p>
       <w:r>
-        <w:lastRenderedPageBreak/>
         <w:t>A dropout in the first second after an app connects is normal and does not light the lamp. Changing Latency clears the lamps, because the old warnings no longer apply. Hover over a lit lamp and the status bar suggests raising Latency.</w:t>
       </w:r>
     </w:p>
@@ -736,10 +787,10 @@
           <w:noProof/>
         </w:rPr>
         <w:drawing>
-          <wp:inline distT="0" distB="0" distL="0" distR="0" wp14:anchorId="507DDF1C" wp14:editId="78D41F64">
+          <wp:inline distT="0" distB="0" distL="0" distR="0" wp14:anchorId="02A3F798" wp14:editId="26B16326">
             <wp:extent cx="4955003" cy="1905770"/>
             <wp:effectExtent l="0" t="0" r="0" b="0"/>
-            <wp:docPr id="818011462" name="Picture 6"/>
+            <wp:docPr id="144583473" name="Picture 7"/>
             <wp:cNvGraphicFramePr>
               <a:graphicFrameLocks xmlns:a="http://schemas.openxmlformats.org/drawingml/2006/main" noChangeAspect="1"/>
             </wp:cNvGraphicFramePr>
@@ -747,11 +798,11 @@
               <a:graphicData uri="http://schemas.openxmlformats.org/drawingml/2006/picture">
                 <pic:pic xmlns:pic="http://schemas.openxmlformats.org/drawingml/2006/picture">
                   <pic:nvPicPr>
-                    <pic:cNvPr id="818011462" name=""/>
+                    <pic:cNvPr id="144583473" name=""/>
                     <pic:cNvPicPr/>
                   </pic:nvPicPr>
                   <pic:blipFill>
-                    <a:blip r:embed="rId8">
+                    <a:blip r:embed="rId9">
                       <a:extLst>
                         <a:ext uri="{28A0092B-C50C-407E-A947-70E740481C1C}">
                           <a14:useLocalDpi xmlns:a14="http://schemas.microsoft.com/office/drawing/2010/main" val="0"/>
@@ -794,11 +845,12 @@
         <w:rPr>
           <w:noProof/>
         </w:rPr>
+        <w:lastRenderedPageBreak/>
         <w:drawing>
-          <wp:inline distT="0" distB="0" distL="0" distR="0" wp14:anchorId="17291462" wp14:editId="06961969">
+          <wp:inline distT="0" distB="0" distL="0" distR="0" wp14:anchorId="2284FE88" wp14:editId="6A7E30D5">
             <wp:extent cx="1644952" cy="4318000"/>
             <wp:effectExtent l="0" t="0" r="0" b="6350"/>
-            <wp:docPr id="1013854741" name="Picture 7"/>
+            <wp:docPr id="500617775" name="Picture 8"/>
             <wp:cNvGraphicFramePr>
               <a:graphicFrameLocks xmlns:a="http://schemas.openxmlformats.org/drawingml/2006/main" noChangeAspect="1"/>
             </wp:cNvGraphicFramePr>
@@ -806,11 +858,11 @@
               <a:graphicData uri="http://schemas.openxmlformats.org/drawingml/2006/picture">
                 <pic:pic xmlns:pic="http://schemas.openxmlformats.org/drawingml/2006/picture">
                   <pic:nvPicPr>
-                    <pic:cNvPr id="1013854741" name=""/>
+                    <pic:cNvPr id="500617775" name=""/>
                     <pic:cNvPicPr/>
                   </pic:nvPicPr>
                   <pic:blipFill>
-                    <a:blip r:embed="rId9">
+                    <a:blip r:embed="rId10">
                       <a:extLst>
                         <a:ext uri="{28A0092B-C50C-407E-A947-70E740481C1C}">
                           <a14:useLocalDpi xmlns:a14="http://schemas.microsoft.com/office/drawing/2010/main" val="0"/>
@@ -1208,7 +1260,7 @@
   <w:abstractNum w:abstractNumId="0" w15:restartNumberingAfterBreak="0">
     <w:nsid w:val="FFFFFF89"/>
     <w:multiLevelType w:val="singleLevel"/>
-    <w:tmpl w:val="4B78CF52"/>
+    <w:tmpl w:val="4C3E4810"/>
     <w:lvl w:ilvl="0">
       <w:start w:val="1"/>
       <w:numFmt w:val="bullet"/>
@@ -1226,7 +1278,7 @@
       </w:rPr>
     </w:lvl>
   </w:abstractNum>
-  <w:num w:numId="1" w16cid:durableId="1195460933">
+  <w:num w:numId="1" w16cid:durableId="57169369">
     <w:abstractNumId w:val="0"/>
   </w:num>
 </w:numbering>
@@ -1640,7 +1692,7 @@
     <w:link w:val="Heading1Char"/>
     <w:uiPriority w:val="9"/>
     <w:qFormat/>
-    <w:rsid w:val="00F637ED"/>
+    <w:rsid w:val="00D44E40"/>
     <w:pPr>
       <w:keepNext/>
       <w:keepLines/>
@@ -1662,7 +1714,7 @@
     <w:uiPriority w:val="9"/>
     <w:unhideWhenUsed/>
     <w:qFormat/>
-    <w:rsid w:val="00F637ED"/>
+    <w:rsid w:val="00D44E40"/>
     <w:pPr>
       <w:keepNext/>
       <w:keepLines/>
@@ -1685,7 +1737,7 @@
     <w:semiHidden/>
     <w:unhideWhenUsed/>
     <w:qFormat/>
-    <w:rsid w:val="00F637ED"/>
+    <w:rsid w:val="00D44E40"/>
     <w:pPr>
       <w:keepNext/>
       <w:keepLines/>
@@ -1708,7 +1760,7 @@
     <w:semiHidden/>
     <w:unhideWhenUsed/>
     <w:qFormat/>
-    <w:rsid w:val="00F637ED"/>
+    <w:rsid w:val="00D44E40"/>
     <w:pPr>
       <w:keepNext/>
       <w:keepLines/>
@@ -1731,7 +1783,7 @@
     <w:semiHidden/>
     <w:unhideWhenUsed/>
     <w:qFormat/>
-    <w:rsid w:val="00F637ED"/>
+    <w:rsid w:val="00D44E40"/>
     <w:pPr>
       <w:keepNext/>
       <w:keepLines/>
@@ -1752,7 +1804,7 @@
     <w:semiHidden/>
     <w:unhideWhenUsed/>
     <w:qFormat/>
-    <w:rsid w:val="00F637ED"/>
+    <w:rsid w:val="00D44E40"/>
     <w:pPr>
       <w:keepNext/>
       <w:keepLines/>
@@ -1775,7 +1827,7 @@
     <w:semiHidden/>
     <w:unhideWhenUsed/>
     <w:qFormat/>
-    <w:rsid w:val="00F637ED"/>
+    <w:rsid w:val="00D44E40"/>
     <w:pPr>
       <w:keepNext/>
       <w:keepLines/>
@@ -1796,7 +1848,7 @@
     <w:semiHidden/>
     <w:unhideWhenUsed/>
     <w:qFormat/>
-    <w:rsid w:val="00F637ED"/>
+    <w:rsid w:val="00D44E40"/>
     <w:pPr>
       <w:keepNext/>
       <w:keepLines/>
@@ -1819,7 +1871,7 @@
     <w:semiHidden/>
     <w:unhideWhenUsed/>
     <w:qFormat/>
-    <w:rsid w:val="00F637ED"/>
+    <w:rsid w:val="00D44E40"/>
     <w:pPr>
       <w:keepNext/>
       <w:keepLines/>
@@ -1863,7 +1915,7 @@
     <w:basedOn w:val="DefaultParagraphFont"/>
     <w:link w:val="Heading1"/>
     <w:uiPriority w:val="9"/>
-    <w:rsid w:val="00F637ED"/>
+    <w:rsid w:val="00D44E40"/>
     <w:rPr>
       <w:rFonts w:asciiTheme="majorHAnsi" w:eastAsiaTheme="majorEastAsia" w:hAnsiTheme="majorHAnsi" w:cstheme="majorBidi"/>
       <w:color w:val="0F4761" w:themeColor="accent1" w:themeShade="BF"/>
@@ -1876,7 +1928,7 @@
     <w:basedOn w:val="DefaultParagraphFont"/>
     <w:link w:val="Heading2"/>
     <w:uiPriority w:val="9"/>
-    <w:rsid w:val="00F637ED"/>
+    <w:rsid w:val="00D44E40"/>
     <w:rPr>
       <w:rFonts w:asciiTheme="majorHAnsi" w:eastAsiaTheme="majorEastAsia" w:hAnsiTheme="majorHAnsi" w:cstheme="majorBidi"/>
       <w:color w:val="0F4761" w:themeColor="accent1" w:themeShade="BF"/>
@@ -1890,7 +1942,7 @@
     <w:link w:val="Heading3"/>
     <w:uiPriority w:val="9"/>
     <w:semiHidden/>
-    <w:rsid w:val="00F637ED"/>
+    <w:rsid w:val="00D44E40"/>
     <w:rPr>
       <w:rFonts w:eastAsiaTheme="majorEastAsia" w:cstheme="majorBidi"/>
       <w:color w:val="0F4761" w:themeColor="accent1" w:themeShade="BF"/>
@@ -1904,7 +1956,7 @@
     <w:link w:val="Heading4"/>
     <w:uiPriority w:val="9"/>
     <w:semiHidden/>
-    <w:rsid w:val="00F637ED"/>
+    <w:rsid w:val="00D44E40"/>
     <w:rPr>
       <w:rFonts w:eastAsiaTheme="majorEastAsia" w:cstheme="majorBidi"/>
       <w:i/>
@@ -1918,7 +1970,7 @@
     <w:link w:val="Heading5"/>
     <w:uiPriority w:val="9"/>
     <w:semiHidden/>
-    <w:rsid w:val="00F637ED"/>
+    <w:rsid w:val="00D44E40"/>
     <w:rPr>
       <w:rFonts w:eastAsiaTheme="majorEastAsia" w:cstheme="majorBidi"/>
       <w:color w:val="0F4761" w:themeColor="accent1" w:themeShade="BF"/>
@@ -1930,7 +1982,7 @@
     <w:link w:val="Heading6"/>
     <w:uiPriority w:val="9"/>
     <w:semiHidden/>
-    <w:rsid w:val="00F637ED"/>
+    <w:rsid w:val="00D44E40"/>
     <w:rPr>
       <w:rFonts w:eastAsiaTheme="majorEastAsia" w:cstheme="majorBidi"/>
       <w:i/>
@@ -1944,7 +1996,7 @@
     <w:link w:val="Heading7"/>
     <w:uiPriority w:val="9"/>
     <w:semiHidden/>
-    <w:rsid w:val="00F637ED"/>
+    <w:rsid w:val="00D44E40"/>
     <w:rPr>
       <w:rFonts w:eastAsiaTheme="majorEastAsia" w:cstheme="majorBidi"/>
       <w:color w:val="595959" w:themeColor="text1" w:themeTint="A6"/>
@@ -1956,7 +2008,7 @@
     <w:link w:val="Heading8"/>
     <w:uiPriority w:val="9"/>
     <w:semiHidden/>
-    <w:rsid w:val="00F637ED"/>
+    <w:rsid w:val="00D44E40"/>
     <w:rPr>
       <w:rFonts w:eastAsiaTheme="majorEastAsia" w:cstheme="majorBidi"/>
       <w:i/>
@@ -1970,7 +2022,7 @@
     <w:link w:val="Heading9"/>
     <w:uiPriority w:val="9"/>
     <w:semiHidden/>
-    <w:rsid w:val="00F637ED"/>
+    <w:rsid w:val="00D44E40"/>
     <w:rPr>
       <w:rFonts w:eastAsiaTheme="majorEastAsia" w:cstheme="majorBidi"/>
       <w:color w:val="272727" w:themeColor="text1" w:themeTint="D8"/>
@@ -1983,7 +2035,7 @@
     <w:link w:val="TitleChar"/>
     <w:uiPriority w:val="10"/>
     <w:qFormat/>
-    <w:rsid w:val="00F637ED"/>
+    <w:rsid w:val="00D44E40"/>
     <w:pPr>
       <w:spacing w:after="80" w:line="240" w:lineRule="auto"/>
       <w:contextualSpacing/>
@@ -2001,7 +2053,7 @@
     <w:basedOn w:val="DefaultParagraphFont"/>
     <w:link w:val="Title"/>
     <w:uiPriority w:val="10"/>
-    <w:rsid w:val="00F637ED"/>
+    <w:rsid w:val="00D44E40"/>
     <w:rPr>
       <w:rFonts w:asciiTheme="majorHAnsi" w:eastAsiaTheme="majorEastAsia" w:hAnsiTheme="majorHAnsi" w:cstheme="majorBidi"/>
       <w:spacing w:val="-10"/>
@@ -2017,7 +2069,7 @@
     <w:link w:val="SubtitleChar"/>
     <w:uiPriority w:val="11"/>
     <w:qFormat/>
-    <w:rsid w:val="00F637ED"/>
+    <w:rsid w:val="00D44E40"/>
     <w:pPr>
       <w:numPr>
         <w:ilvl w:val="1"/>
@@ -2036,7 +2088,7 @@
     <w:basedOn w:val="DefaultParagraphFont"/>
     <w:link w:val="Subtitle"/>
     <w:uiPriority w:val="11"/>
-    <w:rsid w:val="00F637ED"/>
+    <w:rsid w:val="00D44E40"/>
     <w:rPr>
       <w:rFonts w:eastAsiaTheme="majorEastAsia" w:cstheme="majorBidi"/>
       <w:color w:val="595959" w:themeColor="text1" w:themeTint="A6"/>
@@ -2052,7 +2104,7 @@
     <w:link w:val="QuoteChar"/>
     <w:uiPriority w:val="29"/>
     <w:qFormat/>
-    <w:rsid w:val="00F637ED"/>
+    <w:rsid w:val="00D44E40"/>
     <w:pPr>
       <w:spacing w:before="160"/>
       <w:jc w:val="center"/>
@@ -2068,7 +2120,7 @@
     <w:basedOn w:val="DefaultParagraphFont"/>
     <w:link w:val="Quote"/>
     <w:uiPriority w:val="29"/>
-    <w:rsid w:val="00F637ED"/>
+    <w:rsid w:val="00D44E40"/>
     <w:rPr>
       <w:i/>
       <w:iCs/>
@@ -2080,7 +2132,7 @@
     <w:basedOn w:val="Normal"/>
     <w:uiPriority w:val="34"/>
     <w:qFormat/>
-    <w:rsid w:val="00F637ED"/>
+    <w:rsid w:val="00D44E40"/>
     <w:pPr>
       <w:ind w:left="720"/>
       <w:contextualSpacing/>
@@ -2091,7 +2143,7 @@
     <w:basedOn w:val="DefaultParagraphFont"/>
     <w:uiPriority w:val="21"/>
     <w:qFormat/>
-    <w:rsid w:val="00F637ED"/>
+    <w:rsid w:val="00D44E40"/>
     <w:rPr>
       <w:i/>
       <w:iCs/>
@@ -2105,7 +2157,7 @@
     <w:link w:val="IntenseQuoteChar"/>
     <w:uiPriority w:val="30"/>
     <w:qFormat/>
-    <w:rsid w:val="00F637ED"/>
+    <w:rsid w:val="00D44E40"/>
     <w:pPr>
       <w:pBdr>
         <w:top w:val="single" w:sz="4" w:space="10" w:color="0F4761" w:themeColor="accent1" w:themeShade="BF"/>
@@ -2126,7 +2178,7 @@
     <w:basedOn w:val="DefaultParagraphFont"/>
     <w:link w:val="IntenseQuote"/>
     <w:uiPriority w:val="30"/>
-    <w:rsid w:val="00F637ED"/>
+    <w:rsid w:val="00D44E40"/>
     <w:rPr>
       <w:i/>
       <w:iCs/>
@@ -2138,7 +2190,7 @@
     <w:basedOn w:val="DefaultParagraphFont"/>
     <w:uiPriority w:val="32"/>
     <w:qFormat/>
-    <w:rsid w:val="00F637ED"/>
+    <w:rsid w:val="00D44E40"/>
     <w:rPr>
       <w:b/>
       <w:bCs/>
@@ -2152,7 +2204,7 @@
     <w:basedOn w:val="Normal"/>
     <w:uiPriority w:val="99"/>
     <w:unhideWhenUsed/>
-    <w:rsid w:val="00F637ED"/>
+    <w:rsid w:val="00D44E40"/>
     <w:pPr>
       <w:numPr>
         <w:numId w:val="1"/>

</xml_diff>

<commit_message>
Manuals: mu-Link screenshots refreshed from Release v1.1.0.1450 (9 images), manual regenerated
Co-Authored-By: Claude Sonnet 5.5 <noreply@anthropic.com>
</commit_message>
<xml_diff>
--- a/docs/mu-link/mu-link User Manual.docx
+++ b/docs/mu-link/mu-link User Manual.docx
@@ -74,10 +74,10 @@
           <w:noProof/>
         </w:rPr>
         <w:drawing>
-          <wp:inline distT="0" distB="0" distL="0" distR="0" wp14:anchorId="61C48AB9" wp14:editId="5F6ADA5D">
-            <wp:extent cx="5274310" cy="4058920"/>
+          <wp:inline distT="0" distB="0" distL="0" distR="0" wp14:anchorId="42C6B04A" wp14:editId="7AB0046D">
+            <wp:extent cx="5274310" cy="4059555"/>
             <wp:effectExtent l="0" t="0" r="2540" b="0"/>
-            <wp:docPr id="682546089" name="Picture 1"/>
+            <wp:docPr id="176360147" name="Picture 1"/>
             <wp:cNvGraphicFramePr>
               <a:graphicFrameLocks xmlns:a="http://schemas.openxmlformats.org/drawingml/2006/main" noChangeAspect="1"/>
             </wp:cNvGraphicFramePr>
@@ -85,7 +85,7 @@
               <a:graphicData uri="http://schemas.openxmlformats.org/drawingml/2006/picture">
                 <pic:pic xmlns:pic="http://schemas.openxmlformats.org/drawingml/2006/picture">
                   <pic:nvPicPr>
-                    <pic:cNvPr id="682546089" name=""/>
+                    <pic:cNvPr id="176360147" name=""/>
                     <pic:cNvPicPr/>
                   </pic:nvPicPr>
                   <pic:blipFill>
@@ -103,7 +103,7 @@
                   <pic:spPr>
                     <a:xfrm>
                       <a:off x="0" y="0"/>
-                      <a:ext cx="5274310" cy="4058920"/>
+                      <a:ext cx="5274310" cy="4059555"/>
                     </a:xfrm>
                     <a:prstGeom prst="rect">
                       <a:avLst/>
@@ -218,10 +218,10 @@
         </w:rPr>
         <w:lastRenderedPageBreak/>
         <w:drawing>
-          <wp:inline distT="0" distB="0" distL="0" distR="0" wp14:anchorId="5D040DBF" wp14:editId="7A69CB69">
-            <wp:extent cx="5274310" cy="4058920"/>
+          <wp:inline distT="0" distB="0" distL="0" distR="0" wp14:anchorId="02E9E96F" wp14:editId="4D738F1E">
+            <wp:extent cx="5274310" cy="4059555"/>
             <wp:effectExtent l="0" t="0" r="2540" b="0"/>
-            <wp:docPr id="1528675695" name="Picture 2"/>
+            <wp:docPr id="1302811158" name="Picture 2"/>
             <wp:cNvGraphicFramePr>
               <a:graphicFrameLocks xmlns:a="http://schemas.openxmlformats.org/drawingml/2006/main" noChangeAspect="1"/>
             </wp:cNvGraphicFramePr>
@@ -229,7 +229,7 @@
               <a:graphicData uri="http://schemas.openxmlformats.org/drawingml/2006/picture">
                 <pic:pic xmlns:pic="http://schemas.openxmlformats.org/drawingml/2006/picture">
                   <pic:nvPicPr>
-                    <pic:cNvPr id="1528675695" name=""/>
+                    <pic:cNvPr id="1302811158" name=""/>
                     <pic:cNvPicPr/>
                   </pic:nvPicPr>
                   <pic:blipFill>
@@ -247,7 +247,7 @@
                   <pic:spPr>
                     <a:xfrm>
                       <a:off x="0" y="0"/>
-                      <a:ext cx="5274310" cy="4058920"/>
+                      <a:ext cx="5274310" cy="4059555"/>
                     </a:xfrm>
                     <a:prstGeom prst="rect">
                       <a:avLst/>
@@ -362,10 +362,10 @@
           <w:noProof/>
         </w:rPr>
         <w:drawing>
-          <wp:inline distT="0" distB="0" distL="0" distR="0" wp14:anchorId="7933F235" wp14:editId="1D7A5A1F">
-            <wp:extent cx="5145580" cy="1905770"/>
-            <wp:effectExtent l="0" t="0" r="0" b="0"/>
-            <wp:docPr id="39178361" name="Picture 3"/>
+          <wp:inline distT="0" distB="0" distL="0" distR="0" wp14:anchorId="0C63B78F" wp14:editId="227F497D">
+            <wp:extent cx="5143500" cy="2828925"/>
+            <wp:effectExtent l="0" t="0" r="0" b="9525"/>
+            <wp:docPr id="34731580" name="Picture 3"/>
             <wp:cNvGraphicFramePr>
               <a:graphicFrameLocks xmlns:a="http://schemas.openxmlformats.org/drawingml/2006/main" noChangeAspect="1"/>
             </wp:cNvGraphicFramePr>
@@ -373,7 +373,7 @@
               <a:graphicData uri="http://schemas.openxmlformats.org/drawingml/2006/picture">
                 <pic:pic xmlns:pic="http://schemas.openxmlformats.org/drawingml/2006/picture">
                   <pic:nvPicPr>
-                    <pic:cNvPr id="39178361" name=""/>
+                    <pic:cNvPr id="34731580" name=""/>
                     <pic:cNvPicPr/>
                   </pic:nvPicPr>
                   <pic:blipFill>
@@ -391,7 +391,7 @@
                   <pic:spPr>
                     <a:xfrm>
                       <a:off x="0" y="0"/>
-                      <a:ext cx="5145580" cy="1905770"/>
+                      <a:ext cx="5143500" cy="2828925"/>
                     </a:xfrm>
                     <a:prstGeom prst="rect">
                       <a:avLst/>
@@ -422,10 +422,10 @@
         </w:rPr>
         <w:lastRenderedPageBreak/>
         <w:drawing>
-          <wp:inline distT="0" distB="0" distL="0" distR="0" wp14:anchorId="7F73552C" wp14:editId="7908DB19">
-            <wp:extent cx="3658111" cy="2905530"/>
-            <wp:effectExtent l="0" t="0" r="0" b="0"/>
-            <wp:docPr id="362220432" name="Picture 4"/>
+          <wp:inline distT="0" distB="0" distL="0" distR="0" wp14:anchorId="1C402CA8" wp14:editId="1D7A35B1">
+            <wp:extent cx="3667125" cy="3886200"/>
+            <wp:effectExtent l="0" t="0" r="9525" b="0"/>
+            <wp:docPr id="1520282903" name="Picture 4"/>
             <wp:cNvGraphicFramePr>
               <a:graphicFrameLocks xmlns:a="http://schemas.openxmlformats.org/drawingml/2006/main" noChangeAspect="1"/>
             </wp:cNvGraphicFramePr>
@@ -433,7 +433,7 @@
               <a:graphicData uri="http://schemas.openxmlformats.org/drawingml/2006/picture">
                 <pic:pic xmlns:pic="http://schemas.openxmlformats.org/drawingml/2006/picture">
                   <pic:nvPicPr>
-                    <pic:cNvPr id="362220432" name=""/>
+                    <pic:cNvPr id="1520282903" name=""/>
                     <pic:cNvPicPr/>
                   </pic:nvPicPr>
                   <pic:blipFill>
@@ -451,7 +451,7 @@
                   <pic:spPr>
                     <a:xfrm>
                       <a:off x="0" y="0"/>
-                      <a:ext cx="3658111" cy="2905530"/>
+                      <a:ext cx="3667125" cy="3886200"/>
                     </a:xfrm>
                     <a:prstGeom prst="rect">
                       <a:avLst/>
@@ -546,12 +546,12 @@
         <w:pStyle w:val="ListBullet"/>
       </w:pPr>
       <w:r>
+        <w:lastRenderedPageBreak/>
         <w:t>While connected, mu-Clid holds that MIDI output port itself: choosing none in its MIDI settings has no effect until mu-link disconnects. On disconnect it sends all-notes-off to the port and hands it back to the app.</w:t>
       </w:r>
     </w:p>
     <w:p>
       <w:r>
-        <w:lastRenderedPageBreak/>
         <w:t>mu-link's own MIDI output, chosen in the Audio / MIDI devices dialog, carries only MIDI clock and transport messages (see MIDI Clock Out). Give mu-Clid a different MIDI output port, because many Windows MIDI ports can be opened by only one application at a time.</w:t>
       </w:r>
     </w:p>
@@ -574,10 +574,10 @@
           <w:noProof/>
         </w:rPr>
         <w:drawing>
-          <wp:inline distT="0" distB="0" distL="0" distR="0" wp14:anchorId="42A0141B" wp14:editId="790B06C5">
-            <wp:extent cx="5274310" cy="4058920"/>
+          <wp:inline distT="0" distB="0" distL="0" distR="0" wp14:anchorId="4BE22D9F" wp14:editId="6D01DC71">
+            <wp:extent cx="5274310" cy="4059555"/>
             <wp:effectExtent l="0" t="0" r="2540" b="0"/>
-            <wp:docPr id="1505056350" name="Picture 5"/>
+            <wp:docPr id="1063848018" name="Picture 5"/>
             <wp:cNvGraphicFramePr>
               <a:graphicFrameLocks xmlns:a="http://schemas.openxmlformats.org/drawingml/2006/main" noChangeAspect="1"/>
             </wp:cNvGraphicFramePr>
@@ -585,7 +585,7 @@
               <a:graphicData uri="http://schemas.openxmlformats.org/drawingml/2006/picture">
                 <pic:pic xmlns:pic="http://schemas.openxmlformats.org/drawingml/2006/picture">
                   <pic:nvPicPr>
-                    <pic:cNvPr id="1505056350" name=""/>
+                    <pic:cNvPr id="1063848018" name=""/>
                     <pic:cNvPicPr/>
                   </pic:nvPicPr>
                   <pic:blipFill>
@@ -603,7 +603,7 @@
                   <pic:spPr>
                     <a:xfrm>
                       <a:off x="0" y="0"/>
-                      <a:ext cx="5274310" cy="4058920"/>
+                      <a:ext cx="5274310" cy="4059555"/>
                     </a:xfrm>
                     <a:prstGeom prst="rect">
                       <a:avLst/>
@@ -650,6 +650,7 @@
         <w:pStyle w:val="ListBullet"/>
       </w:pPr>
       <w:r>
+        <w:lastRenderedPageBreak/>
         <w:t>Stereo meter — two bars beside the fader show the left and right levels of that app. Each bar has a clip marker that lights if the signal reaches full scale and stays lit until you click the meter to clear it.</w:t>
       </w:r>
     </w:p>
@@ -666,7 +667,6 @@
         <w:pStyle w:val="ListBullet"/>
       </w:pPr>
       <w:r>
-        <w:lastRenderedPageBreak/>
         <w:t>Solo (S) — hears only the soloed app(s); everything else is muted while any Solo is active.</w:t>
       </w:r>
     </w:p>
@@ -697,10 +697,10 @@
           <w:noProof/>
         </w:rPr>
         <w:drawing>
-          <wp:inline distT="0" distB="0" distL="0" distR="0" wp14:anchorId="552F9B01" wp14:editId="7B42926F">
-            <wp:extent cx="5274310" cy="4058920"/>
+          <wp:inline distT="0" distB="0" distL="0" distR="0" wp14:anchorId="46C57FBD" wp14:editId="119E850C">
+            <wp:extent cx="5274310" cy="4059555"/>
             <wp:effectExtent l="0" t="0" r="2540" b="0"/>
-            <wp:docPr id="424231382" name="Picture 6"/>
+            <wp:docPr id="512924874" name="Picture 6"/>
             <wp:cNvGraphicFramePr>
               <a:graphicFrameLocks xmlns:a="http://schemas.openxmlformats.org/drawingml/2006/main" noChangeAspect="1"/>
             </wp:cNvGraphicFramePr>
@@ -708,7 +708,7 @@
               <a:graphicData uri="http://schemas.openxmlformats.org/drawingml/2006/picture">
                 <pic:pic xmlns:pic="http://schemas.openxmlformats.org/drawingml/2006/picture">
                   <pic:nvPicPr>
-                    <pic:cNvPr id="424231382" name=""/>
+                    <pic:cNvPr id="512924874" name=""/>
                     <pic:cNvPicPr/>
                   </pic:nvPicPr>
                   <pic:blipFill>
@@ -726,7 +726,7 @@
                   <pic:spPr>
                     <a:xfrm>
                       <a:off x="0" y="0"/>
-                      <a:ext cx="5274310" cy="4058920"/>
+                      <a:ext cx="5274310" cy="4059555"/>
                     </a:xfrm>
                     <a:prstGeom prst="rect">
                       <a:avLst/>
@@ -770,12 +770,12 @@
         <w:pStyle w:val="ListBullet"/>
       </w:pPr>
       <w:r>
+        <w:lastRenderedPageBreak/>
         <w:t>Latency — Low, Normal or High. Low is about 43 milliseconds at 48 kHz, Normal about 85 milliseconds, High about 171 milliseconds (2048, 4096 and 8192 frames). Default: Normal. The setting applies to every connected app at once, and to any app that connects later. mu-link remembers it between sessions.</w:t>
       </w:r>
     </w:p>
     <w:p>
       <w:r>
-        <w:lastRenderedPageBreak/>
         <w:t>Start with Normal. If you want the tightest response and your computer copes, try Low. If you hear dropouts or clicks from an app, raise Latency to High.</w:t>
       </w:r>
     </w:p>
@@ -827,10 +827,10 @@
           <w:noProof/>
         </w:rPr>
         <w:drawing>
-          <wp:inline distT="0" distB="0" distL="0" distR="0" wp14:anchorId="274439F2" wp14:editId="7E00DE49">
-            <wp:extent cx="4955003" cy="1905770"/>
+          <wp:inline distT="0" distB="0" distL="0" distR="0" wp14:anchorId="3DA0CBB8" wp14:editId="037332FD">
+            <wp:extent cx="4953000" cy="1905000"/>
             <wp:effectExtent l="0" t="0" r="0" b="0"/>
-            <wp:docPr id="900757837" name="Picture 7"/>
+            <wp:docPr id="924387503" name="Picture 7"/>
             <wp:cNvGraphicFramePr>
               <a:graphicFrameLocks xmlns:a="http://schemas.openxmlformats.org/drawingml/2006/main" noChangeAspect="1"/>
             </wp:cNvGraphicFramePr>
@@ -838,7 +838,7 @@
               <a:graphicData uri="http://schemas.openxmlformats.org/drawingml/2006/picture">
                 <pic:pic xmlns:pic="http://schemas.openxmlformats.org/drawingml/2006/picture">
                   <pic:nvPicPr>
-                    <pic:cNvPr id="900757837" name=""/>
+                    <pic:cNvPr id="924387503" name=""/>
                     <pic:cNvPicPr/>
                   </pic:nvPicPr>
                   <pic:blipFill>
@@ -856,7 +856,7 @@
                   <pic:spPr>
                     <a:xfrm>
                       <a:off x="0" y="0"/>
-                      <a:ext cx="4955003" cy="1905770"/>
+                      <a:ext cx="4953000" cy="1905000"/>
                     </a:xfrm>
                     <a:prstGeom prst="rect">
                       <a:avLst/>
@@ -887,10 +887,10 @@
         </w:rPr>
         <w:lastRenderedPageBreak/>
         <w:drawing>
-          <wp:inline distT="0" distB="0" distL="0" distR="0" wp14:anchorId="61BE4A85" wp14:editId="4B015C27">
+          <wp:inline distT="0" distB="0" distL="0" distR="0" wp14:anchorId="2FBE3A47" wp14:editId="50CB14E6">
             <wp:extent cx="1644952" cy="4318000"/>
             <wp:effectExtent l="0" t="0" r="0" b="6350"/>
-            <wp:docPr id="2130089084" name="Picture 8"/>
+            <wp:docPr id="1287043536" name="Picture 8"/>
             <wp:cNvGraphicFramePr>
               <a:graphicFrameLocks xmlns:a="http://schemas.openxmlformats.org/drawingml/2006/main" noChangeAspect="1"/>
             </wp:cNvGraphicFramePr>
@@ -898,7 +898,7 @@
               <a:graphicData uri="http://schemas.openxmlformats.org/drawingml/2006/picture">
                 <pic:pic xmlns:pic="http://schemas.openxmlformats.org/drawingml/2006/picture">
                   <pic:nvPicPr>
-                    <pic:cNvPr id="2130089084" name=""/>
+                    <pic:cNvPr id="1287043536" name=""/>
                     <pic:cNvPicPr/>
                   </pic:nvPicPr>
                   <pic:blipFill>
@@ -1059,10 +1059,10 @@
           <w:noProof/>
         </w:rPr>
         <w:drawing>
-          <wp:inline distT="0" distB="0" distL="0" distR="0" wp14:anchorId="59A520FE" wp14:editId="7D5B4BB2">
-            <wp:extent cx="5274310" cy="300990"/>
-            <wp:effectExtent l="0" t="0" r="2540" b="3810"/>
-            <wp:docPr id="1249258426" name="Picture 9"/>
+          <wp:inline distT="0" distB="0" distL="0" distR="0" wp14:anchorId="53CCB87D" wp14:editId="35543BD3">
+            <wp:extent cx="5274310" cy="301625"/>
+            <wp:effectExtent l="0" t="0" r="2540" b="3175"/>
+            <wp:docPr id="180213424" name="Picture 9"/>
             <wp:cNvGraphicFramePr>
               <a:graphicFrameLocks xmlns:a="http://schemas.openxmlformats.org/drawingml/2006/main" noChangeAspect="1"/>
             </wp:cNvGraphicFramePr>
@@ -1070,7 +1070,7 @@
               <a:graphicData uri="http://schemas.openxmlformats.org/drawingml/2006/picture">
                 <pic:pic xmlns:pic="http://schemas.openxmlformats.org/drawingml/2006/picture">
                   <pic:nvPicPr>
-                    <pic:cNvPr id="1249258426" name=""/>
+                    <pic:cNvPr id="180213424" name=""/>
                     <pic:cNvPicPr/>
                   </pic:nvPicPr>
                   <pic:blipFill>
@@ -1088,7 +1088,7 @@
                   <pic:spPr>
                     <a:xfrm>
                       <a:off x="0" y="0"/>
-                      <a:ext cx="5274310" cy="300990"/>
+                      <a:ext cx="5274310" cy="301625"/>
                     </a:xfrm>
                     <a:prstGeom prst="rect">
                       <a:avLst/>
@@ -1352,7 +1352,7 @@
   <w:abstractNum w:abstractNumId="0" w15:restartNumberingAfterBreak="0">
     <w:nsid w:val="FFFFFF89"/>
     <w:multiLevelType w:val="singleLevel"/>
-    <w:tmpl w:val="CFA2135E"/>
+    <w:tmpl w:val="CB46E3DA"/>
     <w:lvl w:ilvl="0">
       <w:start w:val="1"/>
       <w:numFmt w:val="bullet"/>
@@ -1370,7 +1370,7 @@
       </w:rPr>
     </w:lvl>
   </w:abstractNum>
-  <w:num w:numId="1" w16cid:durableId="182060271">
+  <w:num w:numId="1" w16cid:durableId="240020649">
     <w:abstractNumId w:val="0"/>
   </w:num>
 </w:numbering>
@@ -1784,7 +1784,7 @@
     <w:link w:val="Heading1Char"/>
     <w:uiPriority w:val="9"/>
     <w:qFormat/>
-    <w:rsid w:val="00786D29"/>
+    <w:rsid w:val="00FE19AB"/>
     <w:pPr>
       <w:keepNext/>
       <w:keepLines/>
@@ -1806,7 +1806,7 @@
     <w:uiPriority w:val="9"/>
     <w:unhideWhenUsed/>
     <w:qFormat/>
-    <w:rsid w:val="00786D29"/>
+    <w:rsid w:val="00FE19AB"/>
     <w:pPr>
       <w:keepNext/>
       <w:keepLines/>
@@ -1829,7 +1829,7 @@
     <w:semiHidden/>
     <w:unhideWhenUsed/>
     <w:qFormat/>
-    <w:rsid w:val="00786D29"/>
+    <w:rsid w:val="00FE19AB"/>
     <w:pPr>
       <w:keepNext/>
       <w:keepLines/>
@@ -1852,7 +1852,7 @@
     <w:semiHidden/>
     <w:unhideWhenUsed/>
     <w:qFormat/>
-    <w:rsid w:val="00786D29"/>
+    <w:rsid w:val="00FE19AB"/>
     <w:pPr>
       <w:keepNext/>
       <w:keepLines/>
@@ -1875,7 +1875,7 @@
     <w:semiHidden/>
     <w:unhideWhenUsed/>
     <w:qFormat/>
-    <w:rsid w:val="00786D29"/>
+    <w:rsid w:val="00FE19AB"/>
     <w:pPr>
       <w:keepNext/>
       <w:keepLines/>
@@ -1896,7 +1896,7 @@
     <w:semiHidden/>
     <w:unhideWhenUsed/>
     <w:qFormat/>
-    <w:rsid w:val="00786D29"/>
+    <w:rsid w:val="00FE19AB"/>
     <w:pPr>
       <w:keepNext/>
       <w:keepLines/>
@@ -1919,7 +1919,7 @@
     <w:semiHidden/>
     <w:unhideWhenUsed/>
     <w:qFormat/>
-    <w:rsid w:val="00786D29"/>
+    <w:rsid w:val="00FE19AB"/>
     <w:pPr>
       <w:keepNext/>
       <w:keepLines/>
@@ -1940,7 +1940,7 @@
     <w:semiHidden/>
     <w:unhideWhenUsed/>
     <w:qFormat/>
-    <w:rsid w:val="00786D29"/>
+    <w:rsid w:val="00FE19AB"/>
     <w:pPr>
       <w:keepNext/>
       <w:keepLines/>
@@ -1963,7 +1963,7 @@
     <w:semiHidden/>
     <w:unhideWhenUsed/>
     <w:qFormat/>
-    <w:rsid w:val="00786D29"/>
+    <w:rsid w:val="00FE19AB"/>
     <w:pPr>
       <w:keepNext/>
       <w:keepLines/>
@@ -2007,7 +2007,7 @@
     <w:basedOn w:val="DefaultParagraphFont"/>
     <w:link w:val="Heading1"/>
     <w:uiPriority w:val="9"/>
-    <w:rsid w:val="00786D29"/>
+    <w:rsid w:val="00FE19AB"/>
     <w:rPr>
       <w:rFonts w:asciiTheme="majorHAnsi" w:eastAsiaTheme="majorEastAsia" w:hAnsiTheme="majorHAnsi" w:cstheme="majorBidi"/>
       <w:color w:val="0F4761" w:themeColor="accent1" w:themeShade="BF"/>
@@ -2020,7 +2020,7 @@
     <w:basedOn w:val="DefaultParagraphFont"/>
     <w:link w:val="Heading2"/>
     <w:uiPriority w:val="9"/>
-    <w:rsid w:val="00786D29"/>
+    <w:rsid w:val="00FE19AB"/>
     <w:rPr>
       <w:rFonts w:asciiTheme="majorHAnsi" w:eastAsiaTheme="majorEastAsia" w:hAnsiTheme="majorHAnsi" w:cstheme="majorBidi"/>
       <w:color w:val="0F4761" w:themeColor="accent1" w:themeShade="BF"/>
@@ -2034,7 +2034,7 @@
     <w:link w:val="Heading3"/>
     <w:uiPriority w:val="9"/>
     <w:semiHidden/>
-    <w:rsid w:val="00786D29"/>
+    <w:rsid w:val="00FE19AB"/>
     <w:rPr>
       <w:rFonts w:eastAsiaTheme="majorEastAsia" w:cstheme="majorBidi"/>
       <w:color w:val="0F4761" w:themeColor="accent1" w:themeShade="BF"/>
@@ -2048,7 +2048,7 @@
     <w:link w:val="Heading4"/>
     <w:uiPriority w:val="9"/>
     <w:semiHidden/>
-    <w:rsid w:val="00786D29"/>
+    <w:rsid w:val="00FE19AB"/>
     <w:rPr>
       <w:rFonts w:eastAsiaTheme="majorEastAsia" w:cstheme="majorBidi"/>
       <w:i/>
@@ -2062,7 +2062,7 @@
     <w:link w:val="Heading5"/>
     <w:uiPriority w:val="9"/>
     <w:semiHidden/>
-    <w:rsid w:val="00786D29"/>
+    <w:rsid w:val="00FE19AB"/>
     <w:rPr>
       <w:rFonts w:eastAsiaTheme="majorEastAsia" w:cstheme="majorBidi"/>
       <w:color w:val="0F4761" w:themeColor="accent1" w:themeShade="BF"/>
@@ -2074,7 +2074,7 @@
     <w:link w:val="Heading6"/>
     <w:uiPriority w:val="9"/>
     <w:semiHidden/>
-    <w:rsid w:val="00786D29"/>
+    <w:rsid w:val="00FE19AB"/>
     <w:rPr>
       <w:rFonts w:eastAsiaTheme="majorEastAsia" w:cstheme="majorBidi"/>
       <w:i/>
@@ -2088,7 +2088,7 @@
     <w:link w:val="Heading7"/>
     <w:uiPriority w:val="9"/>
     <w:semiHidden/>
-    <w:rsid w:val="00786D29"/>
+    <w:rsid w:val="00FE19AB"/>
     <w:rPr>
       <w:rFonts w:eastAsiaTheme="majorEastAsia" w:cstheme="majorBidi"/>
       <w:color w:val="595959" w:themeColor="text1" w:themeTint="A6"/>
@@ -2100,7 +2100,7 @@
     <w:link w:val="Heading8"/>
     <w:uiPriority w:val="9"/>
     <w:semiHidden/>
-    <w:rsid w:val="00786D29"/>
+    <w:rsid w:val="00FE19AB"/>
     <w:rPr>
       <w:rFonts w:eastAsiaTheme="majorEastAsia" w:cstheme="majorBidi"/>
       <w:i/>
@@ -2114,7 +2114,7 @@
     <w:link w:val="Heading9"/>
     <w:uiPriority w:val="9"/>
     <w:semiHidden/>
-    <w:rsid w:val="00786D29"/>
+    <w:rsid w:val="00FE19AB"/>
     <w:rPr>
       <w:rFonts w:eastAsiaTheme="majorEastAsia" w:cstheme="majorBidi"/>
       <w:color w:val="272727" w:themeColor="text1" w:themeTint="D8"/>
@@ -2127,7 +2127,7 @@
     <w:link w:val="TitleChar"/>
     <w:uiPriority w:val="10"/>
     <w:qFormat/>
-    <w:rsid w:val="00786D29"/>
+    <w:rsid w:val="00FE19AB"/>
     <w:pPr>
       <w:spacing w:after="80" w:line="240" w:lineRule="auto"/>
       <w:contextualSpacing/>
@@ -2145,7 +2145,7 @@
     <w:basedOn w:val="DefaultParagraphFont"/>
     <w:link w:val="Title"/>
     <w:uiPriority w:val="10"/>
-    <w:rsid w:val="00786D29"/>
+    <w:rsid w:val="00FE19AB"/>
     <w:rPr>
       <w:rFonts w:asciiTheme="majorHAnsi" w:eastAsiaTheme="majorEastAsia" w:hAnsiTheme="majorHAnsi" w:cstheme="majorBidi"/>
       <w:spacing w:val="-10"/>
@@ -2161,7 +2161,7 @@
     <w:link w:val="SubtitleChar"/>
     <w:uiPriority w:val="11"/>
     <w:qFormat/>
-    <w:rsid w:val="00786D29"/>
+    <w:rsid w:val="00FE19AB"/>
     <w:pPr>
       <w:numPr>
         <w:ilvl w:val="1"/>
@@ -2180,7 +2180,7 @@
     <w:basedOn w:val="DefaultParagraphFont"/>
     <w:link w:val="Subtitle"/>
     <w:uiPriority w:val="11"/>
-    <w:rsid w:val="00786D29"/>
+    <w:rsid w:val="00FE19AB"/>
     <w:rPr>
       <w:rFonts w:eastAsiaTheme="majorEastAsia" w:cstheme="majorBidi"/>
       <w:color w:val="595959" w:themeColor="text1" w:themeTint="A6"/>
@@ -2196,7 +2196,7 @@
     <w:link w:val="QuoteChar"/>
     <w:uiPriority w:val="29"/>
     <w:qFormat/>
-    <w:rsid w:val="00786D29"/>
+    <w:rsid w:val="00FE19AB"/>
     <w:pPr>
       <w:spacing w:before="160"/>
       <w:jc w:val="center"/>
@@ -2212,7 +2212,7 @@
     <w:basedOn w:val="DefaultParagraphFont"/>
     <w:link w:val="Quote"/>
     <w:uiPriority w:val="29"/>
-    <w:rsid w:val="00786D29"/>
+    <w:rsid w:val="00FE19AB"/>
     <w:rPr>
       <w:i/>
       <w:iCs/>
@@ -2224,7 +2224,7 @@
     <w:basedOn w:val="Normal"/>
     <w:uiPriority w:val="34"/>
     <w:qFormat/>
-    <w:rsid w:val="00786D29"/>
+    <w:rsid w:val="00FE19AB"/>
     <w:pPr>
       <w:ind w:left="720"/>
       <w:contextualSpacing/>
@@ -2235,7 +2235,7 @@
     <w:basedOn w:val="DefaultParagraphFont"/>
     <w:uiPriority w:val="21"/>
     <w:qFormat/>
-    <w:rsid w:val="00786D29"/>
+    <w:rsid w:val="00FE19AB"/>
     <w:rPr>
       <w:i/>
       <w:iCs/>
@@ -2249,7 +2249,7 @@
     <w:link w:val="IntenseQuoteChar"/>
     <w:uiPriority w:val="30"/>
     <w:qFormat/>
-    <w:rsid w:val="00786D29"/>
+    <w:rsid w:val="00FE19AB"/>
     <w:pPr>
       <w:pBdr>
         <w:top w:val="single" w:sz="4" w:space="10" w:color="0F4761" w:themeColor="accent1" w:themeShade="BF"/>
@@ -2270,7 +2270,7 @@
     <w:basedOn w:val="DefaultParagraphFont"/>
     <w:link w:val="IntenseQuote"/>
     <w:uiPriority w:val="30"/>
-    <w:rsid w:val="00786D29"/>
+    <w:rsid w:val="00FE19AB"/>
     <w:rPr>
       <w:i/>
       <w:iCs/>
@@ -2282,7 +2282,7 @@
     <w:basedOn w:val="DefaultParagraphFont"/>
     <w:uiPriority w:val="32"/>
     <w:qFormat/>
-    <w:rsid w:val="00786D29"/>
+    <w:rsid w:val="00FE19AB"/>
     <w:rPr>
       <w:b/>
       <w:bCs/>
@@ -2296,7 +2296,7 @@
     <w:basedOn w:val="Normal"/>
     <w:uiPriority w:val="99"/>
     <w:unhideWhenUsed/>
-    <w:rsid w:val="00786D29"/>
+    <w:rsid w:val="00FE19AB"/>
     <w:pPr>
       <w:numPr>
         <w:numId w:val="1"/>

</xml_diff>